<commit_message>
update SOP and report generation
</commit_message>
<xml_diff>
--- a/SOP.docx
+++ b/SOP.docx
@@ -2,13 +2,13 @@
 <file path=word/document.xml><?xml version="1.0" encoding="utf-8"?>
 <w:document xmlns:w="http://schemas.openxmlformats.org/wordprocessingml/2006/main" xmlns:m="http://schemas.openxmlformats.org/officeDocument/2006/math" xmlns:r="http://schemas.openxmlformats.org/officeDocument/2006/relationships" xmlns:o="urn:schemas-microsoft-com:office:office" xmlns:v="urn:schemas-microsoft-com:vml" xmlns:w10="urn:schemas-microsoft-com:office:word" xmlns:a="http://schemas.openxmlformats.org/drawingml/2006/main" xmlns:pic="http://schemas.openxmlformats.org/drawingml/2006/picture" xmlns:wp="http://schemas.openxmlformats.org/drawingml/2006/wordprocessingDrawing">
   <w:body>
-    <w:bookmarkStart w:id="23" w:name="sop-run-the-novaseqx-snakemake-workflow"/>
+    <w:bookmarkStart w:id="23" w:name="Xf545693c798895b0dcb17e60e7147db885fa773"/>
     <w:p>
       <w:pPr>
         <w:pStyle w:val="Heading1"/>
       </w:pPr>
       <w:r>
-        <w:t xml:space="preserve">SOP: Run the NovaSeqX Snakemake Workflow</w:t>
+        <w:t xml:space="preserve">SOP: Run the Illumina BCL Conversion Snakemake Workflow</w:t>
       </w:r>
     </w:p>
     <w:p>
@@ -16,7 +16,51 @@
         <w:pStyle w:val="FirstParagraph"/>
       </w:pPr>
       <w:r>
-        <w:t xml:space="preserve">This SOP provides clear, human‑readable steps to execute the NovaSeqX BCL conversion pipeline from start to finish.</w:t>
+        <w:t xml:space="preserve">This SOP provides clear, human‑readable steps to execute the BCL conversion pipeline from</w:t>
+      </w:r>
+      <w:r>
+        <w:t xml:space="preserve"> </w:t>
+      </w:r>
+      <w:r>
+        <w:t xml:space="preserve">start to finish. It supports both</w:t>
+      </w:r>
+      <w:r>
+        <w:t xml:space="preserve"> </w:t>
+      </w:r>
+      <w:r>
+        <w:rPr>
+          <w:b/>
+          <w:bCs/>
+        </w:rPr>
+        <w:t xml:space="preserve">MiSeq i100</w:t>
+      </w:r>
+      <w:r>
+        <w:t xml:space="preserve"> </w:t>
+      </w:r>
+      <w:r>
+        <w:t xml:space="preserve">and</w:t>
+      </w:r>
+      <w:r>
+        <w:t xml:space="preserve"> </w:t>
+      </w:r>
+      <w:r>
+        <w:rPr>
+          <w:b/>
+          <w:bCs/>
+        </w:rPr>
+        <w:t xml:space="preserve">NovaSeqX</w:t>
+      </w:r>
+      <w:r>
+        <w:t xml:space="preserve"> </w:t>
+      </w:r>
+      <w:r>
+        <w:t xml:space="preserve">runs — the platform is</w:t>
+      </w:r>
+      <w:r>
+        <w:t xml:space="preserve"> </w:t>
+      </w:r>
+      <w:r>
+        <w:t xml:space="preserve">auto-detected from the metadata workbook (see step 5).</w:t>
       </w:r>
     </w:p>
     <w:bookmarkStart w:id="9" w:name="verify-prerequisites"/>
@@ -36,7 +80,7 @@
         </w:numPr>
       </w:pPr>
       <w:r>
-        <w:t xml:space="preserve">You have access to the run directory where bcl data is stored on dragen.</w:t>
+        <w:t xml:space="preserve">You have access to the run directory where BCL data is stored on dragen.</w:t>
       </w:r>
     </w:p>
     <w:p>
@@ -47,7 +91,22 @@
         </w:numPr>
       </w:pPr>
       <w:r>
-        <w:t xml:space="preserve">The run has finished copying (there is a CopyComplete.txt file in the run directory)</w:t>
+        <w:t xml:space="preserve">The run has finished copying (there is a</w:t>
+      </w:r>
+      <w:r>
+        <w:t xml:space="preserve"> </w:t>
+      </w:r>
+      <w:r>
+        <w:rPr>
+          <w:rStyle w:val="VerbatimChar"/>
+        </w:rPr>
+        <w:t xml:space="preserve">CopyComplete.txt</w:t>
+      </w:r>
+      <w:r>
+        <w:t xml:space="preserve"> </w:t>
+      </w:r>
+      <w:r>
+        <w:t xml:space="preserve">file in the run directory).</w:t>
       </w:r>
     </w:p>
     <w:p>
@@ -58,7 +117,16 @@
         </w:numPr>
       </w:pPr>
       <w:r>
-        <w:t xml:space="preserve">You have a SampleSheet (.xslx) Excel file from the lab.</w:t>
+        <w:t xml:space="preserve">You have a SampleSheet (</w:t>
+      </w:r>
+      <w:r>
+        <w:rPr>
+          <w:rStyle w:val="VerbatimChar"/>
+        </w:rPr>
+        <w:t xml:space="preserve">.xlsx</w:t>
+      </w:r>
+      <w:r>
+        <w:t xml:space="preserve">) Excel file from the lab.</w:t>
       </w:r>
     </w:p>
     <w:p>
@@ -69,7 +137,68 @@
         </w:numPr>
       </w:pPr>
       <w:r>
-        <w:t xml:space="preserve">Conda/mamba is installed, otherwise:</w:t>
+        <w:rPr>
+          <w:b/>
+          <w:bCs/>
+        </w:rPr>
+        <w:t xml:space="preserve">DRAGEN</w:t>
+      </w:r>
+      <w:r>
+        <w:t xml:space="preserve"> </w:t>
+      </w:r>
+      <w:r>
+        <w:t xml:space="preserve">is available on the system (</w:t>
+      </w:r>
+      <w:r>
+        <w:rPr>
+          <w:rStyle w:val="VerbatimChar"/>
+        </w:rPr>
+        <w:t xml:space="preserve">which dragen</w:t>
+      </w:r>
+      <w:r>
+        <w:t xml:space="preserve"> </w:t>
+      </w:r>
+      <w:r>
+        <w:t xml:space="preserve">→</w:t>
+      </w:r>
+      <w:r>
+        <w:t xml:space="preserve"> </w:t>
+      </w:r>
+      <w:r>
+        <w:rPr>
+          <w:rStyle w:val="VerbatimChar"/>
+        </w:rPr>
+        <w:t xml:space="preserve">/opt/dragen/&lt;ver&gt;/bin/dragen</w:t>
+      </w:r>
+      <w:r>
+        <w:t xml:space="preserve">).</w:t>
+      </w:r>
+      <w:r>
+        <w:t xml:space="preserve"> </w:t>
+      </w:r>
+      <w:r>
+        <w:t xml:space="preserve">DRAGEN is licensed/FPGA-tied and is installed at the system level, not by pixi.</w:t>
+      </w:r>
+    </w:p>
+    <w:p>
+      <w:pPr>
+        <w:numPr>
+          <w:ilvl w:val="0"/>
+          <w:numId w:val="1001"/>
+        </w:numPr>
+      </w:pPr>
+      <w:r>
+        <w:rPr>
+          <w:b/>
+          <w:bCs/>
+        </w:rPr>
+        <w:t xml:space="preserve">pixi</w:t>
+      </w:r>
+      <w:r>
+        <w:t xml:space="preserve"> </w:t>
+      </w:r>
+      <w:r>
+        <w:t xml:space="preserve">is installed, otherwise install it once:</w:t>
       </w:r>
     </w:p>
     <w:p>
@@ -82,28 +211,55 @@
       </w:pPr>
       <w:r>
         <w:rPr>
-          <w:rStyle w:val="VerbatimChar"/>
-        </w:rPr>
-        <w:t xml:space="preserve">curl -L -O "https://github.com/conda-forge/miniforge/releases/latest/download/Miniforge3-$(uname)-$(uname -m).sh"</w:t>
-      </w:r>
-      <w:r>
-        <w:br/>
-      </w:r>
-      <w:r>
-        <w:rPr>
-          <w:rStyle w:val="VerbatimChar"/>
-        </w:rPr>
-        <w:t xml:space="preserve">bash Miniforge3-$(uname)-$(uname -m).sh</w:t>
+          <w:rStyle w:val="ExtensionTok"/>
+        </w:rPr>
+        <w:t xml:space="preserve">curl</w:t>
+      </w:r>
+      <w:r>
+        <w:rPr>
+          <w:rStyle w:val="NormalTok"/>
+        </w:rPr>
+        <w:t xml:space="preserve"> </w:t>
+      </w:r>
+      <w:r>
+        <w:rPr>
+          <w:rStyle w:val="AttributeTok"/>
+        </w:rPr>
+        <w:t xml:space="preserve">-fsSL</w:t>
+      </w:r>
+      <w:r>
+        <w:rPr>
+          <w:rStyle w:val="NormalTok"/>
+        </w:rPr>
+        <w:t xml:space="preserve"> https://pixi.sh/install.sh </w:t>
+      </w:r>
+      <w:r>
+        <w:rPr>
+          <w:rStyle w:val="KeywordTok"/>
+        </w:rPr>
+        <w:t xml:space="preserve">|</w:t>
+      </w:r>
+      <w:r>
+        <w:rPr>
+          <w:rStyle w:val="NormalTok"/>
+        </w:rPr>
+        <w:t xml:space="preserve"> </w:t>
+      </w:r>
+      <w:r>
+        <w:rPr>
+          <w:rStyle w:val="FunctionTok"/>
+        </w:rPr>
+        <w:t xml:space="preserve">bash</w:t>
       </w:r>
     </w:p>
     <w:bookmarkEnd w:id="9"/>
-    <w:bookmarkStart w:id="10" w:name="copy-the-project-template."/>
+    <w:bookmarkStart w:id="10" w:name="copy-the-project-template"/>
     <w:p>
       <w:pPr>
         <w:pStyle w:val="Heading2"/>
       </w:pPr>
       <w:r>
-        <w:t xml:space="preserve">1) Copy the project template.</w:t>
+        <w:t xml:space="preserve">2) Copy the project template</w:t>
       </w:r>
     </w:p>
     <w:p>
@@ -115,7 +271,40 @@
         </w:numPr>
       </w:pPr>
       <w:r>
-        <w:t xml:space="preserve">Navigate to the processing directory on dragen</w:t>
+        <w:t xml:space="preserve">Navigate to the processing directory on dragen (choose the platform folder), e.g.:</w:t>
+      </w:r>
+    </w:p>
+    <w:p>
+      <w:pPr>
+        <w:pStyle w:val="Compact"/>
+        <w:numPr>
+          <w:ilvl w:val="1"/>
+          <w:numId w:val="1003"/>
+        </w:numPr>
+      </w:pPr>
+      <w:r>
+        <w:t xml:space="preserve">MiSeq i100:</w:t>
+      </w:r>
+      <w:r>
+        <w:t xml:space="preserve"> </w:t>
+      </w:r>
+      <w:r>
+        <w:rPr>
+          <w:rStyle w:val="VerbatimChar"/>
+        </w:rPr>
+        <w:t xml:space="preserve">cd /staging/nextcloud/testing_illumina/MiSeqi100</w:t>
+      </w:r>
+    </w:p>
+    <w:p>
+      <w:pPr>
+        <w:pStyle w:val="Compact"/>
+        <w:numPr>
+          <w:ilvl w:val="1"/>
+          <w:numId w:val="1003"/>
+        </w:numPr>
+      </w:pPr>
+      <w:r>
+        <w:t xml:space="preserve">NovaSeqX:</w:t>
       </w:r>
       <w:r>
         <w:t xml:space="preserve"> </w:t>
@@ -136,7 +325,7 @@
         </w:numPr>
       </w:pPr>
       <w:r>
-        <w:t xml:space="preserve">Clone the github repository</w:t>
+        <w:t xml:space="preserve">Clone the github repository into a run-named directory:</w:t>
       </w:r>
       <w:r>
         <w:t xml:space="preserve"> </w:t>
@@ -157,38 +346,175 @@
         </w:numPr>
       </w:pPr>
       <w:r>
-        <w:t xml:space="preserve">Enter the project directory</w:t>
-      </w:r>
-      <w:r>
-        <w:t xml:space="preserve"> </w:t>
-      </w:r>
-      <w:r>
-        <w:rPr>
-          <w:rStyle w:val="VerbatimChar"/>
-        </w:rPr>
-        <w:t xml:space="preserve">/staging/nextcloud/testing_illumina/NovaSeqX/{RUN_NAME}</w:t>
+        <w:t xml:space="preserve">Enter the project directory:</w:t>
+      </w:r>
+      <w:r>
+        <w:t xml:space="preserve"> </w:t>
+      </w:r>
+      <w:r>
+        <w:rPr>
+          <w:rStyle w:val="VerbatimChar"/>
+        </w:rPr>
+        <w:t xml:space="preserve">cd {RUN_NAME}</w:t>
       </w:r>
     </w:p>
     <w:bookmarkEnd w:id="10"/>
-    <w:bookmarkStart w:id="11" w:name="activate-the-conda-environment."/>
+    <w:bookmarkStart w:id="11" w:name="provision-the-environment-with-pixi"/>
     <w:p>
       <w:pPr>
         <w:pStyle w:val="Heading2"/>
       </w:pPr>
       <w:r>
-        <w:t xml:space="preserve">2) Activate the conda environment.</w:t>
-      </w:r>
-    </w:p>
-    <w:p>
-      <w:pPr>
-        <w:pStyle w:val="Compact"/>
-        <w:numPr>
-          <w:ilvl w:val="0"/>
-          <w:numId w:val="1003"/>
-        </w:numPr>
-      </w:pPr>
-      <w:r>
-        <w:t xml:space="preserve">Install the</w:t>
+        <w:t xml:space="preserve">3) Provision the environment with pixi</w:t>
+      </w:r>
+    </w:p>
+    <w:p>
+      <w:pPr>
+        <w:pStyle w:val="FirstParagraph"/>
+      </w:pPr>
+      <w:r>
+        <w:t xml:space="preserve">The Python tools and bioinformatics CLIs are provisioned from</w:t>
+      </w:r>
+      <w:r>
+        <w:t xml:space="preserve"> </w:t>
+      </w:r>
+      <w:r>
+        <w:rPr>
+          <w:rStyle w:val="VerbatimChar"/>
+        </w:rPr>
+        <w:t xml:space="preserve">pixi.toml</w:t>
+      </w:r>
+      <w:r>
+        <w:t xml:space="preserve"> </w:t>
+      </w:r>
+      <w:r>
+        <w:t xml:space="preserve">(locked in</w:t>
+      </w:r>
+      <w:r>
+        <w:t xml:space="preserve"> </w:t>
+      </w:r>
+      <w:r>
+        <w:rPr>
+          <w:rStyle w:val="VerbatimChar"/>
+        </w:rPr>
+        <w:t xml:space="preserve">pixi.lock</w:t>
+      </w:r>
+      <w:r>
+        <w:t xml:space="preserve">). This creates a per-project environment under</w:t>
+      </w:r>
+      <w:r>
+        <w:t xml:space="preserve"> </w:t>
+      </w:r>
+      <w:r>
+        <w:rPr>
+          <w:rStyle w:val="VerbatimChar"/>
+        </w:rPr>
+        <w:t xml:space="preserve">.pixi/</w:t>
+      </w:r>
+      <w:r>
+        <w:t xml:space="preserve"> </w:t>
+      </w:r>
+      <w:r>
+        <w:t xml:space="preserve">— no global env to</w:t>
+      </w:r>
+      <w:r>
+        <w:t xml:space="preserve"> </w:t>
+      </w:r>
+      <w:r>
+        <w:t xml:space="preserve">activate.</w:t>
+      </w:r>
+    </w:p>
+    <w:p>
+      <w:pPr>
+        <w:pStyle w:val="SourceCode"/>
+      </w:pPr>
+      <w:r>
+        <w:rPr>
+          <w:rStyle w:val="ExtensionTok"/>
+        </w:rPr>
+        <w:t xml:space="preserve">pixi</w:t>
+      </w:r>
+      <w:r>
+        <w:rPr>
+          <w:rStyle w:val="NormalTok"/>
+        </w:rPr>
+        <w:t xml:space="preserve"> install</w:t>
+      </w:r>
+    </w:p>
+    <w:p>
+      <w:pPr>
+        <w:pStyle w:val="FirstParagraph"/>
+      </w:pPr>
+      <w:r>
+        <w:t xml:space="preserve">This installs Python, Snakemake, and the bioconda CLIs (</w:t>
+      </w:r>
+      <w:r>
+        <w:rPr>
+          <w:rStyle w:val="VerbatimChar"/>
+        </w:rPr>
+        <w:t xml:space="preserve">fastqc</w:t>
+      </w:r>
+      <w:r>
+        <w:t xml:space="preserve">,</w:t>
+      </w:r>
+      <w:r>
+        <w:t xml:space="preserve"> </w:t>
+      </w:r>
+      <w:r>
+        <w:rPr>
+          <w:rStyle w:val="VerbatimChar"/>
+        </w:rPr>
+        <w:t xml:space="preserve">flexbar</w:t>
+      </w:r>
+      <w:r>
+        <w:t xml:space="preserve">,</w:t>
+      </w:r>
+      <w:r>
+        <w:t xml:space="preserve"> </w:t>
+      </w:r>
+      <w:r>
+        <w:rPr>
+          <w:rStyle w:val="VerbatimChar"/>
+        </w:rPr>
+        <w:t xml:space="preserve">seqtk</w:t>
+      </w:r>
+      <w:r>
+        <w:t xml:space="preserve">,</w:t>
+      </w:r>
+      <w:r>
+        <w:t xml:space="preserve"> </w:t>
+      </w:r>
+      <w:r>
+        <w:rPr>
+          <w:rStyle w:val="VerbatimChar"/>
+        </w:rPr>
+        <w:t xml:space="preserve">fqtk</w:t>
+      </w:r>
+      <w:r>
+        <w:t xml:space="preserve">). Run every subsequent command with</w:t>
+      </w:r>
+      <w:r>
+        <w:t xml:space="preserve"> </w:t>
+      </w:r>
+      <w:r>
+        <w:rPr>
+          <w:rStyle w:val="VerbatimChar"/>
+        </w:rPr>
+        <w:t xml:space="preserve">pixi run ...</w:t>
+      </w:r>
+      <w:r>
+        <w:t xml:space="preserve"> </w:t>
+      </w:r>
+      <w:r>
+        <w:t xml:space="preserve">(no activation step needed).</w:t>
+      </w:r>
+    </w:p>
+    <w:p>
+      <w:pPr>
+        <w:pStyle w:val="BlockText"/>
+      </w:pPr>
+      <w:r>
+        <w:t xml:space="preserve">The legacy</w:t>
       </w:r>
       <w:r>
         <w:t xml:space="preserve"> </w:t>
@@ -203,55 +529,13 @@
         <w:t xml:space="preserve"> </w:t>
       </w:r>
       <w:r>
-        <w:t xml:space="preserve">conda environment</w:t>
-      </w:r>
-    </w:p>
-    <w:p>
-      <w:pPr>
-        <w:pStyle w:val="Compact"/>
-        <w:numPr>
-          <w:ilvl w:val="1"/>
-          <w:numId w:val="1004"/>
-        </w:numPr>
-      </w:pPr>
-      <w:r>
-        <w:t xml:space="preserve">The</w:t>
-      </w:r>
-      <w:r>
-        <w:t xml:space="preserve"> </w:t>
-      </w:r>
-      <w:r>
-        <w:rPr>
-          <w:rStyle w:val="VerbatimChar"/>
-        </w:rPr>
-        <w:t xml:space="preserve">bcl_convert</w:t>
-      </w:r>
-      <w:r>
-        <w:t xml:space="preserve"> </w:t>
-      </w:r>
-      <w:r>
-        <w:t xml:space="preserve">conda env needs to be installed only once per user</w:t>
-      </w:r>
-    </w:p>
-    <w:p>
-      <w:pPr>
-        <w:pStyle w:val="Compact"/>
-        <w:numPr>
-          <w:ilvl w:val="1"/>
-          <w:numId w:val="1004"/>
-        </w:numPr>
-      </w:pPr>
-      <w:r>
-        <w:t xml:space="preserve">it needs to be activated every time the workflow is executed</w:t>
-      </w:r>
-      <w:r>
-        <w:t xml:space="preserve"> </w:t>
-      </w:r>
-      <w:r>
-        <w:rPr>
-          <w:rStyle w:val="VerbatimChar"/>
-        </w:rPr>
-        <w:t xml:space="preserve">mamba activate bcl_convert</w:t>
+        <w:t xml:space="preserve">mamba/conda environment is retired in favor of pixi.</w:t>
+      </w:r>
+      <w:r>
+        <w:t xml:space="preserve"> </w:t>
+      </w:r>
+      <w:r>
+        <w:t xml:space="preserve">DRAGEN remains a system-level tool (see step 1) and is not installed by pixi.</w:t>
       </w:r>
     </w:p>
     <w:bookmarkEnd w:id="11"/>
@@ -261,7 +545,102 @@
         <w:pStyle w:val="Heading2"/>
       </w:pPr>
       <w:r>
-        <w:t xml:space="preserve">3) Copy the SampleSheet into the new project</w:t>
+        <w:t xml:space="preserve">4) Copy the SampleSheet into the new project</w:t>
+      </w:r>
+    </w:p>
+    <w:p>
+      <w:pPr>
+        <w:pStyle w:val="Compact"/>
+        <w:numPr>
+          <w:ilvl w:val="0"/>
+          <w:numId w:val="1004"/>
+        </w:numPr>
+      </w:pPr>
+      <w:r>
+        <w:t xml:space="preserve">Upload the Excel SampleSheet into the</w:t>
+      </w:r>
+      <w:r>
+        <w:t xml:space="preserve"> </w:t>
+      </w:r>
+      <w:r>
+        <w:rPr>
+          <w:rStyle w:val="VerbatimChar"/>
+        </w:rPr>
+        <w:t xml:space="preserve">metadata</w:t>
+      </w:r>
+      <w:r>
+        <w:t xml:space="preserve"> </w:t>
+      </w:r>
+      <w:r>
+        <w:t xml:space="preserve">directory:</w:t>
+      </w:r>
+      <w:r>
+        <w:t xml:space="preserve"> </w:t>
+      </w:r>
+      <w:r>
+        <w:rPr>
+          <w:rStyle w:val="VerbatimChar"/>
+        </w:rPr>
+        <w:t xml:space="preserve">{RUN_NAME}/metadata/{SampleSheet.xlsx}</w:t>
+      </w:r>
+    </w:p>
+    <w:bookmarkEnd w:id="12"/>
+    <w:bookmarkStart w:id="13" w:name="review-and-update-configuration"/>
+    <w:p>
+      <w:pPr>
+        <w:pStyle w:val="Heading2"/>
+      </w:pPr>
+      <w:r>
+        <w:t xml:space="preserve">5) Review and update configuration</w:t>
+      </w:r>
+    </w:p>
+    <w:p>
+      <w:pPr>
+        <w:pStyle w:val="FirstParagraph"/>
+      </w:pPr>
+      <w:r>
+        <w:t xml:space="preserve">Open and update the project overrides in</w:t>
+      </w:r>
+      <w:r>
+        <w:t xml:space="preserve"> </w:t>
+      </w:r>
+      <w:r>
+        <w:rPr>
+          <w:rStyle w:val="VerbatimChar"/>
+        </w:rPr>
+        <w:t xml:space="preserve">snakemake_config_project.yaml</w:t>
+      </w:r>
+      <w:r>
+        <w:t xml:space="preserve"> </w:t>
+      </w:r>
+      <w:r>
+        <w:t xml:space="preserve">(these are layered</w:t>
+      </w:r>
+      <w:r>
+        <w:t xml:space="preserve"> </w:t>
+      </w:r>
+      <w:r>
+        <w:t xml:space="preserve">over the base</w:t>
+      </w:r>
+      <w:r>
+        <w:t xml:space="preserve"> </w:t>
+      </w:r>
+      <w:r>
+        <w:rPr>
+          <w:rStyle w:val="VerbatimChar"/>
+        </w:rPr>
+        <w:t xml:space="preserve">snakemake_config.yaml</w:t>
+      </w:r>
+      <w:r>
+        <w:t xml:space="preserve">).</w:t>
+      </w:r>
+    </w:p>
+    <w:p>
+      <w:pPr>
+        <w:pStyle w:val="BodyText"/>
+      </w:pPr>
+      <w:r>
+        <w:t xml:space="preserve">Key fields to update (example values):</w:t>
       </w:r>
     </w:p>
     <w:p>
@@ -273,11 +652,38 @@
         </w:numPr>
       </w:pPr>
       <w:r>
-        <w:t xml:space="preserve">Upload the excel SampleSheet {SampleSheet.xlsx} into the</w:t>
-      </w:r>
-      <w:r>
-        <w:t xml:space="preserve"> </w:t>
-      </w:r>
+        <w:rPr>
+          <w:rStyle w:val="VerbatimChar"/>
+        </w:rPr>
+        <w:t xml:space="preserve">library_name</w:t>
+      </w:r>
+      <w:r>
+        <w:t xml:space="preserve">:</w:t>
+      </w:r>
+      <w:r>
+        <w:t xml:space="preserve"> </w:t>
+      </w:r>
+      <w:r>
+        <w:rPr>
+          <w:rStyle w:val="VerbatimChar"/>
+        </w:rPr>
+        <w:t xml:space="preserve">iR011</w:t>
+      </w:r>
+      <w:r>
+        <w:t xml:space="preserve"> </w:t>
+      </w:r>
+      <w:r>
+        <w:t xml:space="preserve">(the name of the run)</w:t>
+      </w:r>
+    </w:p>
+    <w:p>
+      <w:pPr>
+        <w:pStyle w:val="Compact"/>
+        <w:numPr>
+          <w:ilvl w:val="0"/>
+          <w:numId w:val="1005"/>
+        </w:numPr>
+      </w:pPr>
       <w:r>
         <w:rPr>
           <w:rStyle w:val="VerbatimChar"/>
@@ -285,29 +691,176 @@
         <w:t xml:space="preserve">metadata</w:t>
       </w:r>
       <w:r>
-        <w:t xml:space="preserve"> </w:t>
-      </w:r>
-      <w:r>
-        <w:t xml:space="preserve">directory</w:t>
-      </w:r>
-      <w:r>
-        <w:t xml:space="preserve"> </w:t>
-      </w:r>
-      <w:r>
-        <w:rPr>
-          <w:rStyle w:val="VerbatimChar"/>
-        </w:rPr>
-        <w:t xml:space="preserve">/staging/nextcloud/testing_illumina/NovaseqX/{RUN_NAME}/metadata</w:t>
-      </w:r>
-    </w:p>
-    <w:bookmarkEnd w:id="12"/>
-    <w:bookmarkStart w:id="13" w:name="review-and-update-configuration"/>
+        <w:t xml:space="preserve">:</w:t>
+      </w:r>
+      <w:r>
+        <w:t xml:space="preserve"> </w:t>
+      </w:r>
+      <w:r>
+        <w:rPr>
+          <w:rStyle w:val="VerbatimChar"/>
+        </w:rPr>
+        <w:t xml:space="preserve">metadata/SampleSheet.xlsx</w:t>
+      </w:r>
+      <w:r>
+        <w:t xml:space="preserve"> </w:t>
+      </w:r>
+      <w:r>
+        <w:t xml:space="preserve">(path to the Excel file)</w:t>
+      </w:r>
+    </w:p>
+    <w:p>
+      <w:pPr>
+        <w:pStyle w:val="Compact"/>
+        <w:numPr>
+          <w:ilvl w:val="0"/>
+          <w:numId w:val="1005"/>
+        </w:numPr>
+      </w:pPr>
+      <w:r>
+        <w:rPr>
+          <w:rStyle w:val="VerbatimChar"/>
+        </w:rPr>
+        <w:t xml:space="preserve">data_dir</w:t>
+      </w:r>
+      <w:r>
+        <w:t xml:space="preserve">: the BCL run directory, e.g.</w:t>
+      </w:r>
+    </w:p>
+    <w:p>
+      <w:pPr>
+        <w:pStyle w:val="Compact"/>
+        <w:numPr>
+          <w:ilvl w:val="1"/>
+          <w:numId w:val="1006"/>
+        </w:numPr>
+      </w:pPr>
+      <w:r>
+        <w:t xml:space="preserve">MiSeq i100:</w:t>
+      </w:r>
+      <w:r>
+        <w:t xml:space="preserve"> </w:t>
+      </w:r>
+      <w:r>
+        <w:rPr>
+          <w:rStyle w:val="VerbatimChar"/>
+        </w:rPr>
+        <w:t xml:space="preserve">/staging/nextcloud/Miseqi100/20260626_SH00564_0020_ASC2231455-SC3</w:t>
+      </w:r>
+    </w:p>
+    <w:p>
+      <w:pPr>
+        <w:pStyle w:val="Compact"/>
+        <w:numPr>
+          <w:ilvl w:val="1"/>
+          <w:numId w:val="1006"/>
+        </w:numPr>
+      </w:pPr>
+      <w:r>
+        <w:t xml:space="preserve">NovaSeqX:</w:t>
+      </w:r>
+      <w:r>
+        <w:t xml:space="preserve"> </w:t>
+      </w:r>
+      <w:r>
+        <w:rPr>
+          <w:rStyle w:val="VerbatimChar"/>
+        </w:rPr>
+        <w:t xml:space="preserve">/staging/nextcloud/NovaseqX/20260129_LH00626_0090_B233NGJLT4</w:t>
+      </w:r>
+    </w:p>
+    <w:p>
+      <w:pPr>
+        <w:pStyle w:val="Compact"/>
+        <w:numPr>
+          <w:ilvl w:val="0"/>
+          <w:numId w:val="1005"/>
+        </w:numPr>
+      </w:pPr>
+      <w:r>
+        <w:rPr>
+          <w:rStyle w:val="VerbatimChar"/>
+        </w:rPr>
+        <w:t xml:space="preserve">email_sender</w:t>
+      </w:r>
+      <w:r>
+        <w:t xml:space="preserve">:</w:t>
+      </w:r>
+      <w:r>
+        <w:t xml:space="preserve"> </w:t>
+      </w:r>
+      <w:r>
+        <w:rPr>
+          <w:rStyle w:val="VerbatimChar"/>
+        </w:rPr>
+        <w:t xml:space="preserve">kstachel@uci.edu</w:t>
+      </w:r>
+      <w:r>
+        <w:t xml:space="preserve"> </w:t>
+      </w:r>
+      <w:r>
+        <w:t xml:space="preserve">(sender of email reports)</w:t>
+      </w:r>
+    </w:p>
+    <w:p>
+      <w:pPr>
+        <w:pStyle w:val="Compact"/>
+        <w:numPr>
+          <w:ilvl w:val="0"/>
+          <w:numId w:val="1005"/>
+        </w:numPr>
+      </w:pPr>
+      <w:r>
+        <w:rPr>
+          <w:rStyle w:val="VerbatimChar"/>
+        </w:rPr>
+        <w:t xml:space="preserve">email_recipient</w:t>
+      </w:r>
+      <w:r>
+        <w:t xml:space="preserve">:</w:t>
+      </w:r>
+      <w:r>
+        <w:t xml:space="preserve"> </w:t>
+      </w:r>
+      <w:r>
+        <w:rPr>
+          <w:rStyle w:val="VerbatimChar"/>
+        </w:rPr>
+        <w:t xml:space="preserve">kstachel@uci.edu</w:t>
+      </w:r>
+      <w:r>
+        <w:t xml:space="preserve"> </w:t>
+      </w:r>
+      <w:r>
+        <w:t xml:space="preserve">(recipient of email reports)</w:t>
+      </w:r>
+    </w:p>
+    <w:p>
+      <w:pPr>
+        <w:pStyle w:val="Compact"/>
+        <w:numPr>
+          <w:ilvl w:val="0"/>
+          <w:numId w:val="1005"/>
+        </w:numPr>
+      </w:pPr>
+      <w:r>
+        <w:rPr>
+          <w:rStyle w:val="VerbatimChar"/>
+        </w:rPr>
+        <w:t xml:space="preserve">external_drive_path</w:t>
+      </w:r>
+      <w:r>
+        <w:t xml:space="preserve">: mount point of the external USB drive for rsync</w:t>
+      </w:r>
+    </w:p>
+    <w:bookmarkEnd w:id="13"/>
+    <w:bookmarkStart w:id="14" w:name="validate-metadata"/>
     <w:p>
       <w:pPr>
         <w:pStyle w:val="Heading2"/>
       </w:pPr>
       <w:r>
-        <w:t xml:space="preserve">4) Review and update configuration</w:t>
+        <w:t xml:space="preserve">6) Validate metadata</w:t>
       </w:r>
     </w:p>
     <w:p>
@@ -315,30 +868,7 @@
         <w:pStyle w:val="FirstParagraph"/>
       </w:pPr>
       <w:r>
-        <w:t xml:space="preserve">Open and update the project settings:</w:t>
-      </w:r>
-    </w:p>
-    <w:p>
-      <w:pPr>
-        <w:pStyle w:val="Compact"/>
-        <w:numPr>
-          <w:ilvl w:val="0"/>
-          <w:numId w:val="1006"/>
-        </w:numPr>
-      </w:pPr>
-      <w:r>
-        <w:rPr>
-          <w:rStyle w:val="VerbatimChar"/>
-        </w:rPr>
-        <w:t xml:space="preserve">snakemake_config.yaml</w:t>
-      </w:r>
-    </w:p>
-    <w:p>
-      <w:pPr>
-        <w:pStyle w:val="FirstParagraph"/>
-      </w:pPr>
-      <w:r>
-        <w:t xml:space="preserve">Key fields to update: {example values}</w:t>
+        <w:t xml:space="preserve">The workflow auto-detects the platform from the workbook:</w:t>
       </w:r>
     </w:p>
     <w:p>
@@ -351,12 +881,210 @@
       </w:pPr>
       <w:r>
         <w:rPr>
-          <w:rStyle w:val="VerbatimChar"/>
-        </w:rPr>
-        <w:t xml:space="preserve">library_name</w:t>
-      </w:r>
-      <w:r>
-        <w:t xml:space="preserve">: {xR083} (the name of the run)</w:t>
+          <w:b/>
+          <w:bCs/>
+        </w:rPr>
+        <w:t xml:space="preserve">NovaSeqX</w:t>
+      </w:r>
+      <w:r>
+        <w:t xml:space="preserve"> </w:t>
+      </w:r>
+      <w:r>
+        <w:t xml:space="preserve">(has a</w:t>
+      </w:r>
+      <w:r>
+        <w:t xml:space="preserve"> </w:t>
+      </w:r>
+      <w:r>
+        <w:rPr>
+          <w:rStyle w:val="VerbatimChar"/>
+        </w:rPr>
+        <w:t xml:space="preserve">Summary</w:t>
+      </w:r>
+      <w:r>
+        <w:t xml:space="preserve"> </w:t>
+      </w:r>
+      <w:r>
+        <w:t xml:space="preserve">sheet):</w:t>
+      </w:r>
+    </w:p>
+    <w:p>
+      <w:pPr>
+        <w:pStyle w:val="Compact"/>
+        <w:numPr>
+          <w:ilvl w:val="1"/>
+          <w:numId w:val="1008"/>
+        </w:numPr>
+      </w:pPr>
+      <w:r>
+        <w:rPr>
+          <w:b/>
+          <w:bCs/>
+        </w:rPr>
+        <w:t xml:space="preserve">Summary sheet</w:t>
+      </w:r>
+      <w:r>
+        <w:t xml:space="preserve"> </w:t>
+      </w:r>
+      <w:r>
+        <w:t xml:space="preserve">(header at row 3):</w:t>
+      </w:r>
+      <w:r>
+        <w:t xml:space="preserve"> </w:t>
+      </w:r>
+      <w:r>
+        <w:rPr>
+          <w:rStyle w:val="VerbatimChar"/>
+        </w:rPr>
+        <w:t xml:space="preserve">Lane</w:t>
+      </w:r>
+      <w:r>
+        <w:t xml:space="preserve">,</w:t>
+      </w:r>
+      <w:r>
+        <w:t xml:space="preserve"> </w:t>
+      </w:r>
+      <w:r>
+        <w:rPr>
+          <w:rStyle w:val="VerbatimChar"/>
+        </w:rPr>
+        <w:t xml:space="preserve">Gr</w:t>
+      </w:r>
+      <w:r>
+        <w:t xml:space="preserve"> </w:t>
+      </w:r>
+      <w:r>
+        <w:t xml:space="preserve">(Group),</w:t>
+      </w:r>
+      <w:r>
+        <w:t xml:space="preserve"> </w:t>
+      </w:r>
+      <w:r>
+        <w:rPr>
+          <w:rStyle w:val="VerbatimChar"/>
+        </w:rPr>
+        <w:t xml:space="preserve">Project Name</w:t>
+      </w:r>
+      <w:r>
+        <w:t xml:space="preserve">,</w:t>
+      </w:r>
+      <w:r>
+        <w:t xml:space="preserve"> </w:t>
+      </w:r>
+      <w:r>
+        <w:rPr>
+          <w:rStyle w:val="VerbatimChar"/>
+        </w:rPr>
+        <w:t xml:space="preserve">Masking</w:t>
+      </w:r>
+      <w:r>
+        <w:t xml:space="preserve">,</w:t>
+      </w:r>
+      <w:r>
+        <w:t xml:space="preserve"> </w:t>
+      </w:r>
+      <w:r>
+        <w:rPr>
+          <w:rStyle w:val="VerbatimChar"/>
+        </w:rPr>
+        <w:t xml:space="preserve">Fastq Link</w:t>
+      </w:r>
+    </w:p>
+    <w:p>
+      <w:pPr>
+        <w:pStyle w:val="Compact"/>
+        <w:numPr>
+          <w:ilvl w:val="1"/>
+          <w:numId w:val="1008"/>
+        </w:numPr>
+      </w:pPr>
+      <w:r>
+        <w:rPr>
+          <w:b/>
+          <w:bCs/>
+        </w:rPr>
+        <w:t xml:space="preserve">Per-project sheets</w:t>
+      </w:r>
+      <w:r>
+        <w:t xml:space="preserve">:</w:t>
+      </w:r>
+      <w:r>
+        <w:t xml:space="preserve"> </w:t>
+      </w:r>
+      <w:r>
+        <w:rPr>
+          <w:rStyle w:val="VerbatimChar"/>
+        </w:rPr>
+        <w:t xml:space="preserve">Lane</w:t>
+      </w:r>
+      <w:r>
+        <w:t xml:space="preserve">,</w:t>
+      </w:r>
+      <w:r>
+        <w:t xml:space="preserve"> </w:t>
+      </w:r>
+      <w:r>
+        <w:rPr>
+          <w:rStyle w:val="VerbatimChar"/>
+        </w:rPr>
+        <w:t xml:space="preserve">Group</w:t>
+      </w:r>
+      <w:r>
+        <w:t xml:space="preserve">,</w:t>
+      </w:r>
+      <w:r>
+        <w:t xml:space="preserve"> </w:t>
+      </w:r>
+      <w:r>
+        <w:rPr>
+          <w:rStyle w:val="VerbatimChar"/>
+        </w:rPr>
+        <w:t xml:space="preserve">Sample Name</w:t>
+      </w:r>
+      <w:r>
+        <w:t xml:space="preserve">,</w:t>
+      </w:r>
+      <w:r>
+        <w:t xml:space="preserve"> </w:t>
+      </w:r>
+      <w:r>
+        <w:rPr>
+          <w:rStyle w:val="VerbatimChar"/>
+        </w:rPr>
+        <w:t xml:space="preserve">i7 Barcode Sequence</w:t>
+      </w:r>
+      <w:r>
+        <w:t xml:space="preserve">,</w:t>
+      </w:r>
+      <w:r>
+        <w:t xml:space="preserve"> </w:t>
+      </w:r>
+      <w:r>
+        <w:rPr>
+          <w:rStyle w:val="VerbatimChar"/>
+        </w:rPr>
+        <w:t xml:space="preserve">i5 Barcode Sequence</w:t>
+      </w:r>
+    </w:p>
+    <w:p>
+      <w:pPr>
+        <w:pStyle w:val="Compact"/>
+        <w:numPr>
+          <w:ilvl w:val="1"/>
+          <w:numId w:val="1008"/>
+        </w:numPr>
+      </w:pPr>
+      <w:r>
+        <w:t xml:space="preserve">Ensure Masking strings match the run cycle structure in</w:t>
+      </w:r>
+      <w:r>
+        <w:t xml:space="preserve"> </w:t>
+      </w:r>
+      <w:r>
+        <w:rPr>
+          <w:rStyle w:val="VerbatimChar"/>
+        </w:rPr>
+        <w:t xml:space="preserve">RunInfo.xml</w:t>
       </w:r>
     </w:p>
     <w:p>
@@ -369,151 +1097,46 @@
       </w:pPr>
       <w:r>
         <w:rPr>
-          <w:rStyle w:val="VerbatimChar"/>
-        </w:rPr>
-        <w:t xml:space="preserve">metadata</w:t>
-      </w:r>
-      <w:r>
-        <w:t xml:space="preserve">: {</w:t>
-      </w:r>
-      <w:r>
-        <w:rPr>
-          <w:rStyle w:val="VerbatimChar"/>
-        </w:rPr>
-        <w:t xml:space="preserve">metadata/SampleSheet.xlsx</w:t>
-      </w:r>
-      <w:r>
-        <w:t xml:space="preserve">} (path to the Excel file)</w:t>
-      </w:r>
-    </w:p>
-    <w:p>
-      <w:pPr>
-        <w:pStyle w:val="Compact"/>
-        <w:numPr>
-          <w:ilvl w:val="0"/>
-          <w:numId w:val="1007"/>
-        </w:numPr>
-      </w:pPr>
-      <w:r>
-        <w:rPr>
-          <w:rStyle w:val="VerbatimChar"/>
-        </w:rPr>
-        <w:t xml:space="preserve">data_dir</w:t>
-      </w:r>
-      <w:r>
-        <w:t xml:space="preserve">: {</w:t>
-      </w:r>
-      <w:r>
-        <w:rPr>
-          <w:rStyle w:val="VerbatimChar"/>
-        </w:rPr>
-        <w:t xml:space="preserve">/staging/nextcloud/NovaseqX/20260129_LH00626_0090_B233NGJLT4</w:t>
-      </w:r>
-      <w:r>
-        <w:t xml:space="preserve">} (BCL run directory)</w:t>
-      </w:r>
-    </w:p>
-    <w:p>
-      <w:pPr>
-        <w:pStyle w:val="Compact"/>
-        <w:numPr>
-          <w:ilvl w:val="0"/>
-          <w:numId w:val="1007"/>
-        </w:numPr>
-      </w:pPr>
-      <w:r>
-        <w:rPr>
-          <w:rStyle w:val="VerbatimChar"/>
-        </w:rPr>
-        <w:t xml:space="preserve">email_sender</w:t>
-      </w:r>
-      <w:r>
-        <w:t xml:space="preserve">: {kstachel@uci.edu} (the sender of email reports)</w:t>
-      </w:r>
-    </w:p>
-    <w:p>
-      <w:pPr>
-        <w:pStyle w:val="Compact"/>
-        <w:numPr>
-          <w:ilvl w:val="0"/>
-          <w:numId w:val="1007"/>
-        </w:numPr>
-      </w:pPr>
-      <w:r>
-        <w:rPr>
-          <w:rStyle w:val="VerbatimChar"/>
-        </w:rPr>
-        <w:t xml:space="preserve">email_recipient</w:t>
-      </w:r>
-      <w:r>
-        <w:t xml:space="preserve">: {kstachel@uci.edu} (the recipient of email reports)</w:t>
-      </w:r>
-    </w:p>
-    <w:p>
-      <w:pPr>
-        <w:pStyle w:val="Compact"/>
-        <w:numPr>
-          <w:ilvl w:val="0"/>
-          <w:numId w:val="1007"/>
-        </w:numPr>
-      </w:pPr>
-      <w:r>
-        <w:rPr>
-          <w:rStyle w:val="VerbatimChar"/>
-        </w:rPr>
-        <w:t xml:space="preserve">external_drive_path</w:t>
-      </w:r>
-      <w:r>
-        <w:t xml:space="preserve">: {</w:t>
-      </w:r>
-      <w:r>
-        <w:rPr>
-          <w:rStyle w:val="VerbatimChar"/>
-        </w:rPr>
-        <w:t xml:space="preserve">/mnt/extusb3/nextcloud3/</w:t>
-      </w:r>
-      <w:r>
-        <w:t xml:space="preserve">} (the mount point of the external usb connected to dragen for rsync)</w:t>
-      </w:r>
-    </w:p>
-    <w:bookmarkEnd w:id="13"/>
-    <w:bookmarkStart w:id="14" w:name="validate-metadata"/>
-    <w:p>
-      <w:pPr>
-        <w:pStyle w:val="Heading2"/>
-      </w:pPr>
-      <w:r>
-        <w:t xml:space="preserve">3) Validate metadata</w:t>
-      </w:r>
-    </w:p>
-    <w:p>
-      <w:pPr>
-        <w:pStyle w:val="FirstParagraph"/>
-      </w:pPr>
-      <w:r>
-        <w:t xml:space="preserve">The Excel metadata file must contain:</w:t>
-      </w:r>
-    </w:p>
-    <w:p>
-      <w:pPr>
-        <w:pStyle w:val="Compact"/>
-        <w:numPr>
-          <w:ilvl w:val="0"/>
-          <w:numId w:val="1008"/>
-        </w:numPr>
-      </w:pPr>
-      <w:r>
-        <w:rPr>
           <w:b/>
           <w:bCs/>
         </w:rPr>
-        <w:t xml:space="preserve">Summary sheet</w:t>
-      </w:r>
-      <w:r>
-        <w:t xml:space="preserve"> </w:t>
-      </w:r>
-      <w:r>
-        <w:t xml:space="preserve">(header at row 3):</w:t>
+        <w:t xml:space="preserve">MiSeq i100</w:t>
+      </w:r>
+      <w:r>
+        <w:t xml:space="preserve"> </w:t>
+      </w:r>
+      <w:r>
+        <w:t xml:space="preserve">(has a</w:t>
+      </w:r>
+      <w:r>
+        <w:t xml:space="preserve"> </w:t>
+      </w:r>
+      <w:r>
+        <w:rPr>
+          <w:rStyle w:val="VerbatimChar"/>
+        </w:rPr>
+        <w:t xml:space="preserve">Barcode Entries</w:t>
+      </w:r>
+      <w:r>
+        <w:t xml:space="preserve"> </w:t>
+      </w:r>
+      <w:r>
+        <w:t xml:space="preserve">sheet, no</w:t>
+      </w:r>
+      <w:r>
+        <w:t xml:space="preserve"> </w:t>
+      </w:r>
+      <w:r>
+        <w:rPr>
+          <w:rStyle w:val="VerbatimChar"/>
+        </w:rPr>
+        <w:t xml:space="preserve">Summary</w:t>
+      </w:r>
+      <w:r>
+        <w:t xml:space="preserve"> </w:t>
+      </w:r>
+      <w:r>
+        <w:t xml:space="preserve">sheet):</w:t>
       </w:r>
     </w:p>
     <w:p>
@@ -525,755 +1148,837 @@
         </w:numPr>
       </w:pPr>
       <w:r>
-        <w:rPr>
-          <w:rStyle w:val="VerbatimChar"/>
-        </w:rPr>
-        <w:t xml:space="preserve">Lane</w:t>
-      </w:r>
-      <w:r>
-        <w:t xml:space="preserve">,</w:t>
-      </w:r>
-      <w:r>
-        <w:t xml:space="preserve"> </w:t>
-      </w:r>
-      <w:r>
-        <w:rPr>
-          <w:rStyle w:val="VerbatimChar"/>
-        </w:rPr>
-        <w:t xml:space="preserve">Gr</w:t>
-      </w:r>
-      <w:r>
-        <w:t xml:space="preserve"> </w:t>
-      </w:r>
-      <w:r>
-        <w:t xml:space="preserve">(Group),</w:t>
-      </w:r>
-      <w:r>
-        <w:t xml:space="preserve"> </w:t>
-      </w:r>
-      <w:r>
-        <w:rPr>
-          <w:rStyle w:val="VerbatimChar"/>
-        </w:rPr>
-        <w:t xml:space="preserve">Project Name</w:t>
-      </w:r>
-      <w:r>
-        <w:t xml:space="preserve">,</w:t>
-      </w:r>
-      <w:r>
-        <w:t xml:space="preserve"> </w:t>
-      </w:r>
-      <w:r>
-        <w:rPr>
-          <w:rStyle w:val="VerbatimChar"/>
-        </w:rPr>
-        <w:t xml:space="preserve">Masking</w:t>
-      </w:r>
-      <w:r>
-        <w:t xml:space="preserve">,</w:t>
-      </w:r>
-      <w:r>
-        <w:t xml:space="preserve"> </w:t>
-      </w:r>
-      <w:r>
-        <w:rPr>
-          <w:rStyle w:val="VerbatimChar"/>
-        </w:rPr>
-        <w:t xml:space="preserve">Fastq Link</w:t>
+        <w:t xml:space="preserve">Simple per-sample barcodes; Order IDs inferred from the</w:t>
+      </w:r>
+      <w:r>
+        <w:t xml:space="preserve"> </w:t>
+      </w:r>
+      <w:r>
+        <w:rPr>
+          <w:rStyle w:val="VerbatimChar"/>
+        </w:rPr>
+        <w:t xml:space="preserve">Lab ID</w:t>
+      </w:r>
+      <w:r>
+        <w:t xml:space="preserve"> </w:t>
+      </w:r>
+      <w:r>
+        <w:t xml:space="preserve">column</w:t>
       </w:r>
     </w:p>
     <w:p>
       <w:pPr>
         <w:pStyle w:val="Compact"/>
         <w:numPr>
+          <w:ilvl w:val="1"/>
+          <w:numId w:val="1009"/>
+        </w:numPr>
+      </w:pPr>
+      <w:r>
+        <w:t xml:space="preserve">All samples assigned to a single lane (</w:t>
+      </w:r>
+      <w:r>
+        <w:rPr>
+          <w:rStyle w:val="VerbatimChar"/>
+        </w:rPr>
+        <w:t xml:space="preserve">lane1</w:t>
+      </w:r>
+      <w:r>
+        <w:t xml:space="preserve">) and single group</w:t>
+      </w:r>
+    </w:p>
+    <w:bookmarkEnd w:id="14"/>
+    <w:bookmarkStart w:id="15" w:name="dry-run-recommended"/>
+    <w:p>
+      <w:pPr>
+        <w:pStyle w:val="Heading2"/>
+      </w:pPr>
+      <w:r>
+        <w:t xml:space="preserve">7) Dry run (recommended)</w:t>
+      </w:r>
+    </w:p>
+    <w:p>
+      <w:pPr>
+        <w:pStyle w:val="FirstParagraph"/>
+      </w:pPr>
+      <w:r>
+        <w:t xml:space="preserve">Validate the workflow plan before any processing:</w:t>
+      </w:r>
+    </w:p>
+    <w:p>
+      <w:pPr>
+        <w:pStyle w:val="SourceCode"/>
+      </w:pPr>
+      <w:r>
+        <w:rPr>
+          <w:rStyle w:val="ExtensionTok"/>
+        </w:rPr>
+        <w:t xml:space="preserve">pixi</w:t>
+      </w:r>
+      <w:r>
+        <w:rPr>
+          <w:rStyle w:val="NormalTok"/>
+        </w:rPr>
+        <w:t xml:space="preserve"> run snakemake </w:t>
+      </w:r>
+      <w:r>
+        <w:rPr>
+          <w:rStyle w:val="AttributeTok"/>
+        </w:rPr>
+        <w:t xml:space="preserve">-n</w:t>
+      </w:r>
+    </w:p>
+    <w:p>
+      <w:pPr>
+        <w:pStyle w:val="FirstParagraph"/>
+      </w:pPr>
+      <w:r>
+        <w:t xml:space="preserve">The output prints the detected metadata format. Fix any missing-file or configuration</w:t>
+      </w:r>
+      <w:r>
+        <w:t xml:space="preserve"> </w:t>
+      </w:r>
+      <w:r>
+        <w:t xml:space="preserve">errors before proceeding.</w:t>
+      </w:r>
+    </w:p>
+    <w:bookmarkEnd w:id="15"/>
+    <w:bookmarkStart w:id="16" w:name="run-the-full-workflow"/>
+    <w:p>
+      <w:pPr>
+        <w:pStyle w:val="Heading2"/>
+      </w:pPr>
+      <w:r>
+        <w:t xml:space="preserve">8) Run the full workflow</w:t>
+      </w:r>
+    </w:p>
+    <w:p>
+      <w:pPr>
+        <w:pStyle w:val="FirstParagraph"/>
+      </w:pPr>
+      <w:r>
+        <w:t xml:space="preserve">Execute the entire pipeline (adjust</w:t>
+      </w:r>
+      <w:r>
+        <w:t xml:space="preserve"> </w:t>
+      </w:r>
+      <w:r>
+        <w:rPr>
+          <w:rStyle w:val="VerbatimChar"/>
+        </w:rPr>
+        <w:t xml:space="preserve">--cores</w:t>
+      </w:r>
+      <w:r>
+        <w:t xml:space="preserve"> </w:t>
+      </w:r>
+      <w:r>
+        <w:t xml:space="preserve">to system resources, max 32):</w:t>
+      </w:r>
+    </w:p>
+    <w:p>
+      <w:pPr>
+        <w:pStyle w:val="SourceCode"/>
+      </w:pPr>
+      <w:r>
+        <w:rPr>
+          <w:rStyle w:val="ExtensionTok"/>
+        </w:rPr>
+        <w:t xml:space="preserve">pixi</w:t>
+      </w:r>
+      <w:r>
+        <w:rPr>
+          <w:rStyle w:val="NormalTok"/>
+        </w:rPr>
+        <w:t xml:space="preserve"> run snakemake </w:t>
+      </w:r>
+      <w:r>
+        <w:rPr>
+          <w:rStyle w:val="AttributeTok"/>
+        </w:rPr>
+        <w:t xml:space="preserve">--cores</w:t>
+      </w:r>
+      <w:r>
+        <w:rPr>
+          <w:rStyle w:val="NormalTok"/>
+        </w:rPr>
+        <w:t xml:space="preserve"> 8</w:t>
+      </w:r>
+    </w:p>
+    <w:bookmarkEnd w:id="16"/>
+    <w:bookmarkStart w:id="17" w:name="run-specific-workflow-stages-optional"/>
+    <w:p>
+      <w:pPr>
+        <w:pStyle w:val="Heading2"/>
+      </w:pPr>
+      <w:r>
+        <w:t xml:space="preserve">9) Run specific workflow stages (optional)</w:t>
+      </w:r>
+    </w:p>
+    <w:p>
+      <w:pPr>
+        <w:pStyle w:val="FirstParagraph"/>
+      </w:pPr>
+      <w:r>
+        <w:t xml:space="preserve">Configs are identified per lane as</w:t>
+      </w:r>
+      <w:r>
+        <w:t xml:space="preserve"> </w:t>
+      </w:r>
+      <w:r>
+        <w:rPr>
+          <w:rStyle w:val="VerbatimChar"/>
+        </w:rPr>
+        <w:t xml:space="preserve">lane{N}</w:t>
+      </w:r>
+      <w:r>
+        <w:t xml:space="preserve"> </w:t>
+      </w:r>
+      <w:r>
+        <w:t xml:space="preserve">(MiSeq uses only</w:t>
+      </w:r>
+      <w:r>
+        <w:t xml:space="preserve"> </w:t>
+      </w:r>
+      <w:r>
+        <w:rPr>
+          <w:rStyle w:val="VerbatimChar"/>
+        </w:rPr>
+        <w:t xml:space="preserve">lane1</w:t>
+      </w:r>
+      <w:r>
+        <w:t xml:space="preserve">; NovaSeqX may use</w:t>
+      </w:r>
+      <w:r>
+        <w:t xml:space="preserve"> </w:t>
+      </w:r>
+      <w:r>
+        <w:rPr>
+          <w:rStyle w:val="VerbatimChar"/>
+        </w:rPr>
+        <w:t xml:space="preserve">lane1</w:t>
+      </w:r>
+      <w:r>
+        <w:t xml:space="preserve">…</w:t>
+      </w:r>
+      <w:r>
+        <w:rPr>
+          <w:rStyle w:val="VerbatimChar"/>
+        </w:rPr>
+        <w:t xml:space="preserve">lane8</w:t>
+      </w:r>
+      <w:r>
+        <w:t xml:space="preserve">). Run individual targets, e.g.:</w:t>
+      </w:r>
+    </w:p>
+    <w:p>
+      <w:pPr>
+        <w:pStyle w:val="Compact"/>
+        <w:numPr>
           <w:ilvl w:val="0"/>
-          <w:numId w:val="1008"/>
-        </w:numPr>
+          <w:numId w:val="1010"/>
+        </w:numPr>
+      </w:pPr>
+      <w:r>
+        <w:t xml:space="preserve">BCL conversion for a lane:</w:t>
+      </w:r>
+      <w:r>
+        <w:t xml:space="preserve"> </w:t>
+      </w:r>
+      <w:r>
+        <w:rPr>
+          <w:rStyle w:val="VerbatimChar"/>
+        </w:rPr>
+        <w:t xml:space="preserve">pixi run snakemake --cores 8 output/lane1</w:t>
+      </w:r>
+    </w:p>
+    <w:p>
+      <w:pPr>
+        <w:pStyle w:val="Compact"/>
+        <w:numPr>
+          <w:ilvl w:val="0"/>
+          <w:numId w:val="1010"/>
+        </w:numPr>
+      </w:pPr>
+      <w:r>
+        <w:t xml:space="preserve">FastP analysis for a lane:</w:t>
+      </w:r>
+      <w:r>
+        <w:t xml:space="preserve"> </w:t>
+      </w:r>
+      <w:r>
+        <w:rPr>
+          <w:rStyle w:val="VerbatimChar"/>
+        </w:rPr>
+        <w:t xml:space="preserve">pixi run snakemake --cores 4 results/fastp_lane1.done</w:t>
+      </w:r>
+    </w:p>
+    <w:p>
+      <w:pPr>
+        <w:pStyle w:val="Compact"/>
+        <w:numPr>
+          <w:ilvl w:val="0"/>
+          <w:numId w:val="1010"/>
+        </w:numPr>
+      </w:pPr>
+      <w:r>
+        <w:t xml:space="preserve">FastP plots for a lane:</w:t>
+      </w:r>
+      <w:r>
+        <w:t xml:space="preserve"> </w:t>
+      </w:r>
+      <w:r>
+        <w:rPr>
+          <w:rStyle w:val="VerbatimChar"/>
+        </w:rPr>
+        <w:t xml:space="preserve">pixi run snakemake --cores 4 results/lane1/fastp_plots_lane1.done</w:t>
+      </w:r>
+    </w:p>
+    <w:p>
+      <w:pPr>
+        <w:pStyle w:val="Compact"/>
+        <w:numPr>
+          <w:ilvl w:val="0"/>
+          <w:numId w:val="1010"/>
+        </w:numPr>
+      </w:pPr>
+      <w:r>
+        <w:t xml:space="preserve">Project or Order report:</w:t>
+      </w:r>
+      <w:r>
+        <w:t xml:space="preserve"> </w:t>
+      </w:r>
+      <w:r>
+        <w:rPr>
+          <w:rStyle w:val="VerbatimChar"/>
+        </w:rPr>
+        <w:t xml:space="preserve">pixi run snakemake --cores 1 Reports/order_0626I-08/index.html</w:t>
+      </w:r>
+    </w:p>
+    <w:p>
+      <w:pPr>
+        <w:pStyle w:val="Compact"/>
+        <w:numPr>
+          <w:ilvl w:val="0"/>
+          <w:numId w:val="1010"/>
+        </w:numPr>
+      </w:pPr>
+      <w:r>
+        <w:t xml:space="preserve">Read count CSV:</w:t>
+      </w:r>
+      <w:r>
+        <w:t xml:space="preserve"> </w:t>
+      </w:r>
+      <w:r>
+        <w:rPr>
+          <w:rStyle w:val="VerbatimChar"/>
+        </w:rPr>
+        <w:t xml:space="preserve">pixi run snakemake --cores 1 results/iR011-count.csv</w:t>
+      </w:r>
+    </w:p>
+    <w:bookmarkEnd w:id="17"/>
+    <w:bookmarkStart w:id="18" w:name="validate-outputs"/>
+    <w:p>
+      <w:pPr>
+        <w:pStyle w:val="Heading2"/>
+      </w:pPr>
+      <w:r>
+        <w:t xml:space="preserve">10) Validate outputs</w:t>
+      </w:r>
+    </w:p>
+    <w:p>
+      <w:pPr>
+        <w:pStyle w:val="FirstParagraph"/>
+      </w:pPr>
+      <w:r>
+        <w:t xml:space="preserve">Check that outputs are generated and complete:</w:t>
+      </w:r>
+    </w:p>
+    <w:p>
+      <w:pPr>
+        <w:pStyle w:val="Compact"/>
+        <w:numPr>
+          <w:ilvl w:val="0"/>
+          <w:numId w:val="1011"/>
+        </w:numPr>
+      </w:pPr>
+      <w:r>
+        <w:rPr>
+          <w:rStyle w:val="VerbatimChar"/>
+        </w:rPr>
+        <w:t xml:space="preserve">output/lane{N}/</w:t>
+      </w:r>
+      <w:r>
+        <w:t xml:space="preserve"> </w:t>
+      </w:r>
+      <w:r>
+        <w:t xml:space="preserve">contains project FASTQ files.</w:t>
+      </w:r>
+    </w:p>
+    <w:p>
+      <w:pPr>
+        <w:pStyle w:val="Compact"/>
+        <w:numPr>
+          <w:ilvl w:val="0"/>
+          <w:numId w:val="1011"/>
+        </w:numPr>
+      </w:pPr>
+      <w:r>
+        <w:rPr>
+          <w:rStyle w:val="VerbatimChar"/>
+        </w:rPr>
+        <w:t xml:space="preserve">results/fastp/</w:t>
+      </w:r>
+      <w:r>
+        <w:t xml:space="preserve"> </w:t>
+      </w:r>
+      <w:r>
+        <w:t xml:space="preserve">has JSON stats.</w:t>
+      </w:r>
+    </w:p>
+    <w:p>
+      <w:pPr>
+        <w:pStyle w:val="Compact"/>
+        <w:numPr>
+          <w:ilvl w:val="0"/>
+          <w:numId w:val="1011"/>
+        </w:numPr>
+      </w:pPr>
+      <w:r>
+        <w:rPr>
+          <w:rStyle w:val="VerbatimChar"/>
+        </w:rPr>
+        <w:t xml:space="preserve">results/fastp_plots/</w:t>
+      </w:r>
+      <w:r>
+        <w:t xml:space="preserve"> </w:t>
+      </w:r>
+      <w:r>
+        <w:t xml:space="preserve">has PNG plots.</w:t>
+      </w:r>
+    </w:p>
+    <w:p>
+      <w:pPr>
+        <w:pStyle w:val="Compact"/>
+        <w:numPr>
+          <w:ilvl w:val="0"/>
+          <w:numId w:val="1011"/>
+        </w:numPr>
+      </w:pPr>
+      <w:r>
+        <w:rPr>
+          <w:rStyle w:val="VerbatimChar"/>
+        </w:rPr>
+        <w:t xml:space="preserve">Reports/</w:t>
+      </w:r>
+      <w:r>
+        <w:t xml:space="preserve"> </w:t>
+      </w:r>
+      <w:r>
+        <w:t xml:space="preserve">contains order and project HTML reports plus md5sums and PDFs.</w:t>
+      </w:r>
+    </w:p>
+    <w:p>
+      <w:pPr>
+        <w:pStyle w:val="Compact"/>
+        <w:numPr>
+          <w:ilvl w:val="0"/>
+          <w:numId w:val="1011"/>
+        </w:numPr>
+      </w:pPr>
+      <w:r>
+        <w:rPr>
+          <w:rStyle w:val="VerbatimChar"/>
+        </w:rPr>
+        <w:t xml:space="preserve">results/{library}-count.csv</w:t>
+      </w:r>
+      <w:r>
+        <w:t xml:space="preserve"> </w:t>
+      </w:r>
+      <w:r>
+        <w:t xml:space="preserve">exists and looks correct.</w:t>
+      </w:r>
+    </w:p>
+    <w:bookmarkEnd w:id="18"/>
+    <w:bookmarkStart w:id="19" w:name="Xbbcf0bdedd9ab1dede5e7badd0295eedb90d52a"/>
+    <w:p>
+      <w:pPr>
+        <w:pStyle w:val="Heading2"/>
+      </w:pPr>
+      <w:r>
+        <w:t xml:space="preserve">11) Re-run or update specific steps (if needed)</w:t>
+      </w:r>
+    </w:p>
+    <w:p>
+      <w:pPr>
+        <w:pStyle w:val="FirstParagraph"/>
+      </w:pPr>
+      <w:r>
+        <w:t xml:space="preserve">If you need to re-run a specific rule (e.g., read counts):</w:t>
+      </w:r>
+    </w:p>
+    <w:p>
+      <w:pPr>
+        <w:pStyle w:val="SourceCode"/>
+      </w:pPr>
+      <w:r>
+        <w:rPr>
+          <w:rStyle w:val="ExtensionTok"/>
+        </w:rPr>
+        <w:t xml:space="preserve">pixi</w:t>
+      </w:r>
+      <w:r>
+        <w:rPr>
+          <w:rStyle w:val="NormalTok"/>
+        </w:rPr>
+        <w:t xml:space="preserve"> run snakemake </w:t>
+      </w:r>
+      <w:r>
+        <w:rPr>
+          <w:rStyle w:val="AttributeTok"/>
+        </w:rPr>
+        <w:t xml:space="preserve">--cores</w:t>
+      </w:r>
+      <w:r>
+        <w:rPr>
+          <w:rStyle w:val="NormalTok"/>
+        </w:rPr>
+        <w:t xml:space="preserve"> 4 </w:t>
+      </w:r>
+      <w:r>
+        <w:rPr>
+          <w:rStyle w:val="AttributeTok"/>
+        </w:rPr>
+        <w:t xml:space="preserve">-R</w:t>
+      </w:r>
+      <w:r>
+        <w:rPr>
+          <w:rStyle w:val="NormalTok"/>
+        </w:rPr>
+        <w:t xml:space="preserve"> compile_read_counts</w:t>
+      </w:r>
+    </w:p>
+    <w:bookmarkEnd w:id="19"/>
+    <w:bookmarkStart w:id="20" w:name="troubleshooting-quick-checks"/>
+    <w:p>
+      <w:pPr>
+        <w:pStyle w:val="Heading2"/>
+      </w:pPr>
+      <w:r>
+        <w:t xml:space="preserve">12) Troubleshooting quick checks</w:t>
+      </w:r>
+    </w:p>
+    <w:p>
+      <w:pPr>
+        <w:pStyle w:val="Compact"/>
+        <w:numPr>
+          <w:ilvl w:val="0"/>
+          <w:numId w:val="1012"/>
+        </w:numPr>
+      </w:pPr>
+      <w:r>
+        <w:t xml:space="preserve">Missing lanes: confirm</w:t>
+      </w:r>
+      <w:r>
+        <w:t xml:space="preserve"> </w:t>
+      </w:r>
+      <w:r>
+        <w:rPr>
+          <w:rStyle w:val="VerbatimChar"/>
+        </w:rPr>
+        <w:t xml:space="preserve">data_dir</w:t>
+      </w:r>
+      <w:r>
+        <w:t xml:space="preserve"> </w:t>
+      </w:r>
+      <w:r>
+        <w:t xml:space="preserve">and the detected lanes at workflow start.</w:t>
+      </w:r>
+    </w:p>
+    <w:p>
+      <w:pPr>
+        <w:pStyle w:val="Compact"/>
+        <w:numPr>
+          <w:ilvl w:val="0"/>
+          <w:numId w:val="1012"/>
+        </w:numPr>
+      </w:pPr>
+      <w:r>
+        <w:t xml:space="preserve">BCL conversion failures: verify DRAGEN availability (</w:t>
+      </w:r>
+      <w:r>
+        <w:rPr>
+          <w:rStyle w:val="VerbatimChar"/>
+        </w:rPr>
+        <w:t xml:space="preserve">which dragen</w:t>
+      </w:r>
+      <w:r>
+        <w:t xml:space="preserve">) and run paths.</w:t>
+      </w:r>
+    </w:p>
+    <w:p>
+      <w:pPr>
+        <w:pStyle w:val="Compact"/>
+        <w:numPr>
+          <w:ilvl w:val="0"/>
+          <w:numId w:val="1012"/>
+        </w:numPr>
+      </w:pPr>
+      <w:r>
+        <w:t xml:space="preserve">Empty reports: verify metadata sheet names and headers.</w:t>
+      </w:r>
+    </w:p>
+    <w:p>
+      <w:pPr>
+        <w:pStyle w:val="Compact"/>
+        <w:numPr>
+          <w:ilvl w:val="0"/>
+          <w:numId w:val="1012"/>
+        </w:numPr>
+      </w:pPr>
+      <w:r>
+        <w:t xml:space="preserve">md5 mismatch: regenerate the specific project report outputs.</w:t>
+      </w:r>
+    </w:p>
+    <w:bookmarkEnd w:id="20"/>
+    <w:bookmarkStart w:id="21" w:name="email-configuration"/>
+    <w:p>
+      <w:pPr>
+        <w:pStyle w:val="Heading2"/>
+      </w:pPr>
+      <w:r>
+        <w:t xml:space="preserve">Email Configuration</w:t>
+      </w:r>
+    </w:p>
+    <w:p>
+      <w:pPr>
+        <w:pStyle w:val="FirstParagraph"/>
+      </w:pPr>
+      <w:r>
+        <w:t xml:space="preserve">The workflow uses</w:t>
+      </w:r>
+      <w:r>
+        <w:t xml:space="preserve"> </w:t>
+      </w:r>
+      <w:r>
+        <w:rPr>
+          <w:rStyle w:val="VerbatimChar"/>
+        </w:rPr>
+        <w:t xml:space="preserve">src/send_email.py</w:t>
+      </w:r>
+      <w:r>
+        <w:t xml:space="preserve"> </w:t>
+      </w:r>
+      <w:r>
+        <w:t xml:space="preserve">with support for:</w:t>
+      </w:r>
+      <w:r>
+        <w:t xml:space="preserve"> </w:t>
+      </w:r>
+      <w:r>
+        <w:t xml:space="preserve">- Plain text or HTML content</w:t>
+      </w:r>
+      <w:r>
+        <w:t xml:space="preserve"> </w:t>
+      </w:r>
+      <w:r>
+        <w:t xml:space="preserve">- File attachments</w:t>
+      </w:r>
+      <w:r>
+        <w:t xml:space="preserve"> </w:t>
+      </w:r>
+      <w:r>
+        <w:t xml:space="preserve">- Configurable SMTP settings (default: smtp.uci.edu:25)</w:t>
+      </w:r>
+    </w:p>
+    <w:p>
+      <w:pPr>
+        <w:pStyle w:val="BodyText"/>
+      </w:pPr>
+      <w:r>
+        <w:t xml:space="preserve">For OAuth2 (Gmail):</w:t>
+      </w:r>
+      <w:r>
+        <w:t xml:space="preserve"> </w:t>
+      </w:r>
+      <w:r>
+        <w:t xml:space="preserve">- Set up Google Cloud OAuth2 credentials</w:t>
+      </w:r>
+      <w:r>
+        <w:t xml:space="preserve"> </w:t>
+      </w:r>
+      <w:r>
+        <w:t xml:space="preserve">- Store</w:t>
+      </w:r>
+      <w:r>
+        <w:t xml:space="preserve"> </w:t>
+      </w:r>
+      <w:r>
+        <w:rPr>
+          <w:rStyle w:val="VerbatimChar"/>
+        </w:rPr>
+        <w:t xml:space="preserve">client_secret.json</w:t>
+      </w:r>
+      <w:r>
+        <w:t xml:space="preserve"> </w:t>
+      </w:r>
+      <w:r>
+        <w:t xml:space="preserve">and</w:t>
+      </w:r>
+      <w:r>
+        <w:t xml:space="preserve"> </w:t>
+      </w:r>
+      <w:r>
+        <w:rPr>
+          <w:rStyle w:val="VerbatimChar"/>
+        </w:rPr>
+        <w:t xml:space="preserve">token.json</w:t>
+      </w:r>
+      <w:r>
+        <w:t xml:space="preserve"> </w:t>
+      </w:r>
+      <w:r>
+        <w:t xml:space="preserve">in workspace</w:t>
+      </w:r>
+      <w:r>
+        <w:t xml:space="preserve"> </w:t>
+      </w:r>
+      <w:r>
+        <w:t xml:space="preserve">- Modify</w:t>
+      </w:r>
+      <w:r>
+        <w:t xml:space="preserve"> </w:t>
+      </w:r>
+      <w:r>
+        <w:rPr>
+          <w:rStyle w:val="VerbatimChar"/>
+        </w:rPr>
+        <w:t xml:space="preserve">send_email.py</w:t>
+      </w:r>
+      <w:r>
+        <w:t xml:space="preserve"> </w:t>
+      </w:r>
+      <w:r>
+        <w:t xml:space="preserve">to use</w:t>
+      </w:r>
+      <w:r>
+        <w:t xml:space="preserve"> </w:t>
+      </w:r>
+      <w:r>
+        <w:rPr>
+          <w:rStyle w:val="VerbatimChar"/>
+        </w:rPr>
+        <w:t xml:space="preserve">google-auth</w:t>
+      </w:r>
+      <w:r>
+        <w:t xml:space="preserve"> </w:t>
+      </w:r>
+      <w:r>
+        <w:t xml:space="preserve">libraries</w:t>
+      </w:r>
+      <w:r>
+        <w:t xml:space="preserve"> </w:t>
+      </w:r>
+      <w:r>
+        <w:t xml:space="preserve">- Set environment variables for credential paths</w:t>
+      </w:r>
+    </w:p>
+    <w:bookmarkEnd w:id="21"/>
+    <w:bookmarkStart w:id="22" w:name="advanced-features"/>
+    <w:p>
+      <w:pPr>
+        <w:pStyle w:val="Heading2"/>
+      </w:pPr>
+      <w:r>
+        <w:t xml:space="preserve">Advanced Features</w:t>
+      </w:r>
+    </w:p>
+    <w:p>
+      <w:pPr>
+        <w:pStyle w:val="FirstParagraph"/>
       </w:pPr>
       <w:r>
         <w:rPr>
           <w:b/>
           <w:bCs/>
         </w:rPr>
-        <w:t xml:space="preserve">Per-project sheets</w:t>
-      </w:r>
-      <w:r>
-        <w:t xml:space="preserve"> </w:t>
-      </w:r>
-      <w:r>
-        <w:t xml:space="preserve">with sample details:</w:t>
-      </w:r>
-    </w:p>
-    <w:p>
-      <w:pPr>
-        <w:pStyle w:val="Compact"/>
-        <w:numPr>
-          <w:ilvl w:val="1"/>
-          <w:numId w:val="1010"/>
-        </w:numPr>
-      </w:pPr>
-      <w:r>
-        <w:rPr>
-          <w:rStyle w:val="VerbatimChar"/>
-        </w:rPr>
-        <w:t xml:space="preserve">Lane</w:t>
-      </w:r>
-      <w:r>
-        <w:t xml:space="preserve">,</w:t>
-      </w:r>
-      <w:r>
-        <w:t xml:space="preserve"> </w:t>
-      </w:r>
-      <w:r>
-        <w:rPr>
-          <w:rStyle w:val="VerbatimChar"/>
-        </w:rPr>
-        <w:t xml:space="preserve">Group</w:t>
-      </w:r>
-      <w:r>
-        <w:t xml:space="preserve">,</w:t>
-      </w:r>
-      <w:r>
-        <w:t xml:space="preserve"> </w:t>
-      </w:r>
-      <w:r>
-        <w:rPr>
-          <w:rStyle w:val="VerbatimChar"/>
-        </w:rPr>
-        <w:t xml:space="preserve">Sample Name</w:t>
-      </w:r>
-      <w:r>
-        <w:t xml:space="preserve">,</w:t>
-      </w:r>
-      <w:r>
-        <w:t xml:space="preserve"> </w:t>
-      </w:r>
-      <w:r>
-        <w:rPr>
-          <w:rStyle w:val="VerbatimChar"/>
-        </w:rPr>
-        <w:t xml:space="preserve">i7 Barcode Sequence</w:t>
-      </w:r>
-      <w:r>
-        <w:t xml:space="preserve">,</w:t>
-      </w:r>
-      <w:r>
-        <w:t xml:space="preserve"> </w:t>
-      </w:r>
-      <w:r>
-        <w:rPr>
-          <w:rStyle w:val="VerbatimChar"/>
-        </w:rPr>
-        <w:t xml:space="preserve">i5 Barcode Sequence</w:t>
-      </w:r>
-    </w:p>
-    <w:p>
-      <w:pPr>
-        <w:pStyle w:val="Compact"/>
-        <w:numPr>
-          <w:ilvl w:val="0"/>
-          <w:numId w:val="1008"/>
-        </w:numPr>
-      </w:pPr>
-      <w:r>
-        <w:t xml:space="preserve">Ensure Masking strings match run cycle structure in RunInfo.xml</w:t>
-      </w:r>
-    </w:p>
-    <w:bookmarkEnd w:id="14"/>
-    <w:bookmarkStart w:id="15" w:name="dry-run-recommended"/>
-    <w:p>
-      <w:pPr>
-        <w:pStyle w:val="Heading2"/>
-      </w:pPr>
-      <w:r>
-        <w:t xml:space="preserve">4) Dry run (recommended)</w:t>
-      </w:r>
-    </w:p>
-    <w:p>
-      <w:pPr>
-        <w:pStyle w:val="FirstParagraph"/>
-      </w:pPr>
-      <w:r>
-        <w:t xml:space="preserve">Run a dry run to validate the workflow plan before any processing:</w:t>
-      </w:r>
-    </w:p>
-    <w:p>
-      <w:pPr>
-        <w:pStyle w:val="Compact"/>
-        <w:numPr>
-          <w:ilvl w:val="0"/>
-          <w:numId w:val="1011"/>
-        </w:numPr>
-      </w:pPr>
-      <w:r>
-        <w:rPr>
-          <w:rStyle w:val="VerbatimChar"/>
-        </w:rPr>
-        <w:t xml:space="preserve">snakemake -n</w:t>
-      </w:r>
-    </w:p>
-    <w:p>
-      <w:pPr>
-        <w:pStyle w:val="FirstParagraph"/>
-      </w:pPr>
-      <w:r>
-        <w:t xml:space="preserve">If the dry run shows missing files or configuration errors, fix those before proceeding.</w:t>
-      </w:r>
-    </w:p>
-    <w:bookmarkEnd w:id="15"/>
-    <w:bookmarkStart w:id="16" w:name="run-the-full-workflow"/>
-    <w:p>
-      <w:pPr>
-        <w:pStyle w:val="Heading2"/>
-      </w:pPr>
-      <w:r>
-        <w:t xml:space="preserve">5) Run the full workflow</w:t>
-      </w:r>
-    </w:p>
-    <w:p>
-      <w:pPr>
-        <w:pStyle w:val="FirstParagraph"/>
-      </w:pPr>
-      <w:r>
-        <w:t xml:space="preserve">Execute the entire pipeline:</w:t>
-      </w:r>
-    </w:p>
-    <w:p>
-      <w:pPr>
-        <w:pStyle w:val="Compact"/>
-        <w:numPr>
-          <w:ilvl w:val="0"/>
-          <w:numId w:val="1012"/>
-        </w:numPr>
-      </w:pPr>
-      <w:r>
-        <w:rPr>
-          <w:rStyle w:val="VerbatimChar"/>
-        </w:rPr>
-        <w:t xml:space="preserve">snakemake --cores 8</w:t>
-      </w:r>
-    </w:p>
-    <w:p>
-      <w:pPr>
-        <w:pStyle w:val="FirstParagraph"/>
-      </w:pPr>
-      <w:r>
-        <w:t xml:space="preserve">Adjust</w:t>
-      </w:r>
-      <w:r>
-        <w:t xml:space="preserve"> </w:t>
-      </w:r>
-      <w:r>
-        <w:rPr>
-          <w:rStyle w:val="VerbatimChar"/>
-        </w:rPr>
-        <w:t xml:space="preserve">--cores</w:t>
-      </w:r>
-      <w:r>
-        <w:t xml:space="preserve"> </w:t>
-      </w:r>
-      <w:r>
-        <w:t xml:space="preserve">based on system resources (max 32).</w:t>
-      </w:r>
-    </w:p>
-    <w:bookmarkEnd w:id="16"/>
-    <w:bookmarkStart w:id="17" w:name="run-specific-workflow-stages-optional"/>
-    <w:p>
-      <w:pPr>
-        <w:pStyle w:val="Heading2"/>
-      </w:pPr>
-      <w:r>
-        <w:t xml:space="preserve">6) Run specific workflow stages (optional)</w:t>
-      </w:r>
-    </w:p>
-    <w:p>
-      <w:pPr>
-        <w:pStyle w:val="FirstParagraph"/>
-      </w:pPr>
-      <w:r>
-        <w:t xml:space="preserve">If you only need certain outputs, you can run specific targets:</w:t>
-      </w:r>
-    </w:p>
-    <w:p>
-      <w:pPr>
-        <w:numPr>
-          <w:ilvl w:val="0"/>
-          <w:numId w:val="1013"/>
-        </w:numPr>
-      </w:pPr>
-      <w:r>
-        <w:t xml:space="preserve">BCL conversion for a lane/masking:</w:t>
-      </w:r>
-      <w:r>
-        <w:t xml:space="preserve"> </w:t>
-      </w:r>
-      <w:r>
-        <w:rPr>
-          <w:rStyle w:val="VerbatimChar"/>
-        </w:rPr>
-        <w:t xml:space="preserve">snakemake --cores 8 output/lane1_R1-151_I1-8_I2-8_R2-151</w:t>
-      </w:r>
-    </w:p>
-    <w:p>
-      <w:pPr>
-        <w:numPr>
-          <w:ilvl w:val="0"/>
-          <w:numId w:val="1013"/>
-        </w:numPr>
-      </w:pPr>
-      <w:r>
-        <w:t xml:space="preserve">FastP analysis for a lane/masking:</w:t>
-      </w:r>
-      <w:r>
-        <w:t xml:space="preserve"> </w:t>
-      </w:r>
-      <w:r>
-        <w:rPr>
-          <w:rStyle w:val="VerbatimChar"/>
-        </w:rPr>
-        <w:t xml:space="preserve">snakemake --cores 4 results/fastp_lane1_R1-151_I1-8_I2-8_R2-151.done</w:t>
-      </w:r>
-    </w:p>
-    <w:p>
-      <w:pPr>
-        <w:numPr>
-          <w:ilvl w:val="0"/>
-          <w:numId w:val="1013"/>
-        </w:numPr>
-      </w:pPr>
-      <w:r>
-        <w:t xml:space="preserve">FastP plots for a lane/masking:</w:t>
-      </w:r>
-      <w:r>
-        <w:t xml:space="preserve"> </w:t>
-      </w:r>
-      <w:r>
-        <w:rPr>
-          <w:rStyle w:val="VerbatimChar"/>
-        </w:rPr>
-        <w:t xml:space="preserve">snakemake --cores 4 results/fastp_plots_lane1_R1-151_I1-8_I2-8_R2-151.done</w:t>
-      </w:r>
-    </w:p>
-    <w:p>
-      <w:pPr>
-        <w:numPr>
-          <w:ilvl w:val="0"/>
-          <w:numId w:val="1013"/>
-        </w:numPr>
-      </w:pPr>
-      <w:r>
-        <w:t xml:space="preserve">Project or Order report:</w:t>
-      </w:r>
-      <w:r>
-        <w:t xml:space="preserve"> </w:t>
-      </w:r>
-      <w:r>
-        <w:rPr>
-          <w:rStyle w:val="VerbatimChar"/>
-        </w:rPr>
-        <w:t xml:space="preserve">snakemake --cores 1 Reports/order_12345/index.html</w:t>
-      </w:r>
-    </w:p>
-    <w:p>
-      <w:pPr>
-        <w:numPr>
-          <w:ilvl w:val="0"/>
-          <w:numId w:val="1013"/>
-        </w:numPr>
-      </w:pPr>
-      <w:r>
-        <w:t xml:space="preserve">Read count CSV:</w:t>
-      </w:r>
-      <w:r>
-        <w:t xml:space="preserve"> </w:t>
-      </w:r>
-      <w:r>
-        <w:rPr>
-          <w:rStyle w:val="VerbatimChar"/>
-        </w:rPr>
-        <w:t xml:space="preserve">snakemake --cores 1 results/xR083-count.csv</w:t>
-      </w:r>
-    </w:p>
-    <w:bookmarkEnd w:id="17"/>
-    <w:bookmarkStart w:id="18" w:name="validate-outputs"/>
-    <w:p>
-      <w:pPr>
-        <w:pStyle w:val="Heading2"/>
-      </w:pPr>
-      <w:r>
-        <w:t xml:space="preserve">7) Validate outputs</w:t>
-      </w:r>
-    </w:p>
-    <w:p>
-      <w:pPr>
-        <w:pStyle w:val="FirstParagraph"/>
-      </w:pPr>
-      <w:r>
-        <w:t xml:space="preserve">Check that outputs are generated and complete:</w:t>
-      </w:r>
-    </w:p>
-    <w:p>
-      <w:pPr>
-        <w:pStyle w:val="Compact"/>
-        <w:numPr>
-          <w:ilvl w:val="0"/>
-          <w:numId w:val="1014"/>
-        </w:numPr>
-      </w:pPr>
-      <w:r>
-        <w:rPr>
-          <w:rStyle w:val="VerbatimChar"/>
-        </w:rPr>
-        <w:t xml:space="preserve">output/</w:t>
-      </w:r>
-      <w:r>
-        <w:t xml:space="preserve"> </w:t>
-      </w:r>
-      <w:r>
-        <w:t xml:space="preserve">contains lane and project FASTQ files.</w:t>
-      </w:r>
-    </w:p>
-    <w:p>
-      <w:pPr>
-        <w:pStyle w:val="Compact"/>
-        <w:numPr>
-          <w:ilvl w:val="0"/>
-          <w:numId w:val="1014"/>
-        </w:numPr>
-      </w:pPr>
-      <w:r>
-        <w:rPr>
-          <w:rStyle w:val="VerbatimChar"/>
-        </w:rPr>
-        <w:t xml:space="preserve">results/fastp/</w:t>
-      </w:r>
-      <w:r>
-        <w:t xml:space="preserve"> </w:t>
-      </w:r>
-      <w:r>
-        <w:t xml:space="preserve">has JSON stats.</w:t>
-      </w:r>
-    </w:p>
-    <w:p>
-      <w:pPr>
-        <w:pStyle w:val="Compact"/>
-        <w:numPr>
-          <w:ilvl w:val="0"/>
-          <w:numId w:val="1014"/>
-        </w:numPr>
-      </w:pPr>
-      <w:r>
-        <w:rPr>
-          <w:rStyle w:val="VerbatimChar"/>
-        </w:rPr>
-        <w:t xml:space="preserve">results/fastp_plots/</w:t>
-      </w:r>
-      <w:r>
-        <w:t xml:space="preserve"> </w:t>
-      </w:r>
-      <w:r>
-        <w:t xml:space="preserve">has PNG plots.</w:t>
-      </w:r>
-    </w:p>
-    <w:p>
-      <w:pPr>
-        <w:pStyle w:val="Compact"/>
-        <w:numPr>
-          <w:ilvl w:val="0"/>
-          <w:numId w:val="1014"/>
-        </w:numPr>
-      </w:pPr>
-      <w:r>
-        <w:rPr>
-          <w:rStyle w:val="VerbatimChar"/>
-        </w:rPr>
-        <w:t xml:space="preserve">Reports/</w:t>
-      </w:r>
-      <w:r>
-        <w:t xml:space="preserve"> </w:t>
-      </w:r>
-      <w:r>
-        <w:t xml:space="preserve">contains order and project HTML reports plus md5sums and PDFs.</w:t>
-      </w:r>
-    </w:p>
-    <w:p>
-      <w:pPr>
-        <w:pStyle w:val="Compact"/>
-        <w:numPr>
-          <w:ilvl w:val="0"/>
-          <w:numId w:val="1014"/>
-        </w:numPr>
-      </w:pPr>
-      <w:r>
-        <w:rPr>
-          <w:rStyle w:val="VerbatimChar"/>
-        </w:rPr>
-        <w:t xml:space="preserve">results/{library}-count.csv</w:t>
-      </w:r>
-      <w:r>
-        <w:t xml:space="preserve"> </w:t>
-      </w:r>
-      <w:r>
-        <w:t xml:space="preserve">exists and looks correct.</w:t>
-      </w:r>
-    </w:p>
-    <w:bookmarkEnd w:id="18"/>
-    <w:bookmarkStart w:id="19" w:name="Xbbcf0bdedd9ab1dede5e7badd0295eedb90d52a"/>
-    <w:p>
-      <w:pPr>
-        <w:pStyle w:val="Heading2"/>
-      </w:pPr>
-      <w:r>
-        <w:t xml:space="preserve">8) Re-run or update specific steps (if needed)</w:t>
-      </w:r>
-    </w:p>
-    <w:p>
-      <w:pPr>
-        <w:pStyle w:val="FirstParagraph"/>
-      </w:pPr>
-      <w:r>
-        <w:t xml:space="preserve">If you need to re-run a specific rule (e.g., read counts):</w:t>
-      </w:r>
-    </w:p>
-    <w:p>
-      <w:pPr>
-        <w:pStyle w:val="Compact"/>
-        <w:numPr>
-          <w:ilvl w:val="0"/>
-          <w:numId w:val="1015"/>
-        </w:numPr>
-      </w:pPr>
-      <w:r>
-        <w:rPr>
-          <w:rStyle w:val="VerbatimChar"/>
-        </w:rPr>
-        <w:t xml:space="preserve">snakemake --cores 4 -R compile_read_counts</w:t>
-      </w:r>
-    </w:p>
-    <w:bookmarkEnd w:id="19"/>
-    <w:bookmarkStart w:id="20" w:name="troubleshooting-quick-checks"/>
-    <w:p>
-      <w:pPr>
-        <w:pStyle w:val="Heading2"/>
-      </w:pPr>
-      <w:r>
-        <w:t xml:space="preserve">9) Troubleshooting quick checks</w:t>
-      </w:r>
-    </w:p>
-    <w:p>
-      <w:pPr>
-        <w:pStyle w:val="Compact"/>
-        <w:numPr>
-          <w:ilvl w:val="0"/>
-          <w:numId w:val="1016"/>
-        </w:numPr>
-      </w:pPr>
-      <w:r>
-        <w:t xml:space="preserve">Missing lanes: confirm</w:t>
-      </w:r>
-      <w:r>
-        <w:t xml:space="preserve"> </w:t>
-      </w:r>
-      <w:r>
-        <w:rPr>
-          <w:rStyle w:val="VerbatimChar"/>
-        </w:rPr>
-        <w:t xml:space="preserve">basecalls_path</w:t>
-      </w:r>
-      <w:r>
-        <w:t xml:space="preserve"> </w:t>
-      </w:r>
-      <w:r>
-        <w:t xml:space="preserve">and detected lanes.</w:t>
-      </w:r>
-    </w:p>
-    <w:p>
-      <w:pPr>
-        <w:pStyle w:val="Compact"/>
-        <w:numPr>
-          <w:ilvl w:val="0"/>
-          <w:numId w:val="1016"/>
-        </w:numPr>
-      </w:pPr>
-      <w:r>
-        <w:t xml:space="preserve">BCL conversion failures: verify DRAGEN availability and run paths.</w:t>
-      </w:r>
-    </w:p>
-    <w:p>
-      <w:pPr>
-        <w:pStyle w:val="Compact"/>
-        <w:numPr>
-          <w:ilvl w:val="0"/>
-          <w:numId w:val="1016"/>
-        </w:numPr>
-      </w:pPr>
-      <w:r>
-        <w:t xml:space="preserve">Empty reports: verify metadata sheet names and headers.</w:t>
-      </w:r>
-    </w:p>
-    <w:p>
-      <w:pPr>
-        <w:pStyle w:val="Compact"/>
-        <w:numPr>
-          <w:ilvl w:val="0"/>
-          <w:numId w:val="1016"/>
-        </w:numPr>
-      </w:pPr>
-      <w:r>
-        <w:t xml:space="preserve">md5 mismatch: regenerate the specific project report outputs.</w:t>
-      </w:r>
-    </w:p>
-    <w:bookmarkEnd w:id="20"/>
-    <w:bookmarkStart w:id="21" w:name="email-configuration"/>
-    <w:p>
-      <w:pPr>
-        <w:pStyle w:val="Heading2"/>
-      </w:pPr>
-      <w:r>
-        <w:t xml:space="preserve">Email Configuration</w:t>
-      </w:r>
-    </w:p>
-    <w:p>
-      <w:pPr>
-        <w:pStyle w:val="FirstParagraph"/>
-      </w:pPr>
-      <w:r>
-        <w:t xml:space="preserve">The workflow uses</w:t>
-      </w:r>
-      <w:r>
-        <w:t xml:space="preserve"> </w:t>
-      </w:r>
-      <w:r>
-        <w:rPr>
-          <w:rStyle w:val="VerbatimChar"/>
-        </w:rPr>
-        <w:t xml:space="preserve">src/send_email.py</w:t>
-      </w:r>
-      <w:r>
-        <w:t xml:space="preserve"> </w:t>
-      </w:r>
-      <w:r>
-        <w:t xml:space="preserve">with support for:</w:t>
-      </w:r>
-      <w:r>
-        <w:t xml:space="preserve"> </w:t>
-      </w:r>
-      <w:r>
-        <w:t xml:space="preserve">- Plain text or HTML content</w:t>
-      </w:r>
-      <w:r>
-        <w:t xml:space="preserve"> </w:t>
-      </w:r>
-      <w:r>
-        <w:t xml:space="preserve">- File attachments</w:t>
-      </w:r>
-      <w:r>
-        <w:t xml:space="preserve"> </w:t>
-      </w:r>
-      <w:r>
-        <w:t xml:space="preserve">- Configurable SMTP settings (default: smtp.uci.edu:25)</w:t>
-      </w:r>
-    </w:p>
-    <w:p>
-      <w:pPr>
-        <w:pStyle w:val="BodyText"/>
-      </w:pPr>
-      <w:r>
-        <w:t xml:space="preserve">For OAuth2 (Gmail):</w:t>
-      </w:r>
-      <w:r>
-        <w:t xml:space="preserve"> </w:t>
-      </w:r>
-      <w:r>
-        <w:t xml:space="preserve">- Set up Google Cloud OAuth2 credentials</w:t>
-      </w:r>
-      <w:r>
-        <w:t xml:space="preserve"> </w:t>
-      </w:r>
-      <w:r>
-        <w:t xml:space="preserve">- Store</w:t>
-      </w:r>
-      <w:r>
-        <w:t xml:space="preserve"> </w:t>
-      </w:r>
-      <w:r>
-        <w:rPr>
-          <w:rStyle w:val="VerbatimChar"/>
-        </w:rPr>
-        <w:t xml:space="preserve">client_secret.json</w:t>
-      </w:r>
-      <w:r>
-        <w:t xml:space="preserve"> </w:t>
-      </w:r>
-      <w:r>
-        <w:t xml:space="preserve">and</w:t>
-      </w:r>
-      <w:r>
-        <w:t xml:space="preserve"> </w:t>
-      </w:r>
-      <w:r>
-        <w:rPr>
-          <w:rStyle w:val="VerbatimChar"/>
-        </w:rPr>
-        <w:t xml:space="preserve">token.json</w:t>
-      </w:r>
-      <w:r>
-        <w:t xml:space="preserve"> </w:t>
-      </w:r>
-      <w:r>
-        <w:t xml:space="preserve">in workspace</w:t>
-      </w:r>
-      <w:r>
-        <w:t xml:space="preserve"> </w:t>
-      </w:r>
-      <w:r>
-        <w:t xml:space="preserve">- Modify</w:t>
-      </w:r>
-      <w:r>
-        <w:t xml:space="preserve"> </w:t>
-      </w:r>
-      <w:r>
-        <w:rPr>
-          <w:rStyle w:val="VerbatimChar"/>
-        </w:rPr>
-        <w:t xml:space="preserve">send_email.py</w:t>
-      </w:r>
-      <w:r>
-        <w:t xml:space="preserve"> </w:t>
-      </w:r>
-      <w:r>
-        <w:t xml:space="preserve">to use</w:t>
-      </w:r>
-      <w:r>
-        <w:t xml:space="preserve"> </w:t>
-      </w:r>
-      <w:r>
-        <w:rPr>
-          <w:rStyle w:val="VerbatimChar"/>
-        </w:rPr>
-        <w:t xml:space="preserve">google-auth</w:t>
-      </w:r>
-      <w:r>
-        <w:t xml:space="preserve"> </w:t>
-      </w:r>
-      <w:r>
-        <w:t xml:space="preserve">libraries</w:t>
-      </w:r>
-      <w:r>
-        <w:t xml:space="preserve"> </w:t>
-      </w:r>
-      <w:r>
-        <w:t xml:space="preserve">- Set environment variables for credential paths</w:t>
-      </w:r>
-    </w:p>
-    <w:bookmarkEnd w:id="21"/>
-    <w:bookmarkStart w:id="22" w:name="advanced-features"/>
-    <w:p>
-      <w:pPr>
-        <w:pStyle w:val="Heading2"/>
-      </w:pPr>
-      <w:r>
-        <w:t xml:space="preserve">Advanced Features</w:t>
+        <w:t xml:space="preserve">View rule graph:</w:t>
+      </w:r>
+    </w:p>
+    <w:p>
+      <w:pPr>
+        <w:pStyle w:val="SourceCode"/>
+      </w:pPr>
+      <w:r>
+        <w:rPr>
+          <w:rStyle w:val="ExtensionTok"/>
+        </w:rPr>
+        <w:t xml:space="preserve">pixi</w:t>
+      </w:r>
+      <w:r>
+        <w:rPr>
+          <w:rStyle w:val="NormalTok"/>
+        </w:rPr>
+        <w:t xml:space="preserve"> run snakemake </w:t>
+      </w:r>
+      <w:r>
+        <w:rPr>
+          <w:rStyle w:val="AttributeTok"/>
+        </w:rPr>
+        <w:t xml:space="preserve">--rulegraph</w:t>
+      </w:r>
+      <w:r>
+        <w:rPr>
+          <w:rStyle w:val="NormalTok"/>
+        </w:rPr>
+        <w:t xml:space="preserve"> </w:t>
+      </w:r>
+      <w:r>
+        <w:rPr>
+          <w:rStyle w:val="KeywordTok"/>
+        </w:rPr>
+        <w:t xml:space="preserve">|</w:t>
+      </w:r>
+      <w:r>
+        <w:rPr>
+          <w:rStyle w:val="NormalTok"/>
+        </w:rPr>
+        <w:t xml:space="preserve"> </w:t>
+      </w:r>
+      <w:r>
+        <w:rPr>
+          <w:rStyle w:val="ExtensionTok"/>
+        </w:rPr>
+        <w:t xml:space="preserve">dot</w:t>
+      </w:r>
+      <w:r>
+        <w:rPr>
+          <w:rStyle w:val="NormalTok"/>
+        </w:rPr>
+        <w:t xml:space="preserve"> </w:t>
+      </w:r>
+      <w:r>
+        <w:rPr>
+          <w:rStyle w:val="AttributeTok"/>
+        </w:rPr>
+        <w:t xml:space="preserve">-Tpdf</w:t>
+      </w:r>
+      <w:r>
+        <w:rPr>
+          <w:rStyle w:val="NormalTok"/>
+        </w:rPr>
+        <w:t xml:space="preserve"> </w:t>
+      </w:r>
+      <w:r>
+        <w:rPr>
+          <w:rStyle w:val="OperatorTok"/>
+        </w:rPr>
+        <w:t xml:space="preserve">&gt;</w:t>
+      </w:r>
+      <w:r>
+        <w:rPr>
+          <w:rStyle w:val="NormalTok"/>
+        </w:rPr>
+        <w:t xml:space="preserve"> rulegraph.pdf</w:t>
       </w:r>
     </w:p>
     <w:p>
@@ -1285,7 +1990,7 @@
           <w:b/>
           <w:bCs/>
         </w:rPr>
-        <w:t xml:space="preserve">View rule graph:</w:t>
+        <w:t xml:space="preserve">View complete dependency graph:</w:t>
       </w:r>
     </w:p>
     <w:p>
@@ -1296,19 +2001,19 @@
         <w:rPr>
           <w:rStyle w:val="ExtensionTok"/>
         </w:rPr>
-        <w:t xml:space="preserve">snakemake</w:t>
+        <w:t xml:space="preserve">pixi</w:t>
       </w:r>
       <w:r>
         <w:rPr>
           <w:rStyle w:val="NormalTok"/>
         </w:rPr>
-        <w:t xml:space="preserve"> </w:t>
+        <w:t xml:space="preserve"> run snakemake </w:t>
       </w:r>
       <w:r>
         <w:rPr>
           <w:rStyle w:val="AttributeTok"/>
         </w:rPr>
-        <w:t xml:space="preserve">--rulegraph</w:t>
+        <w:t xml:space="preserve">--dag</w:t>
       </w:r>
       <w:r>
         <w:rPr>
@@ -1362,7 +2067,7 @@
         <w:rPr>
           <w:rStyle w:val="NormalTok"/>
         </w:rPr>
-        <w:t xml:space="preserve"> rulegraph.pdf</w:t>
+        <w:t xml:space="preserve"> dag.pdf</w:t>
       </w:r>
     </w:p>
     <w:p>
@@ -1374,96 +2079,7 @@
           <w:b/>
           <w:bCs/>
         </w:rPr>
-        <w:t xml:space="preserve">View complete dependency graph:</w:t>
-      </w:r>
-    </w:p>
-    <w:p>
-      <w:pPr>
-        <w:pStyle w:val="SourceCode"/>
-      </w:pPr>
-      <w:r>
-        <w:rPr>
-          <w:rStyle w:val="ExtensionTok"/>
-        </w:rPr>
-        <w:t xml:space="preserve">snakemake</w:t>
-      </w:r>
-      <w:r>
-        <w:rPr>
-          <w:rStyle w:val="NormalTok"/>
-        </w:rPr>
-        <w:t xml:space="preserve"> </w:t>
-      </w:r>
-      <w:r>
-        <w:rPr>
-          <w:rStyle w:val="AttributeTok"/>
-        </w:rPr>
-        <w:t xml:space="preserve">--dag</w:t>
-      </w:r>
-      <w:r>
-        <w:rPr>
-          <w:rStyle w:val="NormalTok"/>
-        </w:rPr>
-        <w:t xml:space="preserve"> </w:t>
-      </w:r>
-      <w:r>
-        <w:rPr>
-          <w:rStyle w:val="KeywordTok"/>
-        </w:rPr>
-        <w:t xml:space="preserve">|</w:t>
-      </w:r>
-      <w:r>
-        <w:rPr>
-          <w:rStyle w:val="NormalTok"/>
-        </w:rPr>
-        <w:t xml:space="preserve"> </w:t>
-      </w:r>
-      <w:r>
-        <w:rPr>
-          <w:rStyle w:val="ExtensionTok"/>
-        </w:rPr>
-        <w:t xml:space="preserve">dot</w:t>
-      </w:r>
-      <w:r>
-        <w:rPr>
-          <w:rStyle w:val="NormalTok"/>
-        </w:rPr>
-        <w:t xml:space="preserve"> </w:t>
-      </w:r>
-      <w:r>
-        <w:rPr>
-          <w:rStyle w:val="AttributeTok"/>
-        </w:rPr>
-        <w:t xml:space="preserve">-Tpdf</w:t>
-      </w:r>
-      <w:r>
-        <w:rPr>
-          <w:rStyle w:val="NormalTok"/>
-        </w:rPr>
-        <w:t xml:space="preserve"> </w:t>
-      </w:r>
-      <w:r>
-        <w:rPr>
-          <w:rStyle w:val="OperatorTok"/>
-        </w:rPr>
-        <w:t xml:space="preserve">&gt;</w:t>
-      </w:r>
-      <w:r>
-        <w:rPr>
-          <w:rStyle w:val="NormalTok"/>
-        </w:rPr>
-        <w:t xml:space="preserve"> dag.pdf</w:t>
-      </w:r>
-    </w:p>
-    <w:p>
-      <w:pPr>
-        <w:pStyle w:val="FirstParagraph"/>
-      </w:pPr>
-      <w:r>
-        <w:rPr>
-          <w:b/>
-          <w:bCs/>
-        </w:rPr>
-        <w:t xml:space="preserve">Flexbar demultiplexing</w:t>
+        <w:t xml:space="preserve">Flexbar / inline demultiplexing</w:t>
       </w:r>
       <w:r>
         <w:t xml:space="preserve"> </w:t>
@@ -1475,13 +2091,79 @@
         <w:t xml:space="preserve"> </w:t>
       </w:r>
       <w:r>
-        <w:t xml:space="preserve">- Enable by uncommenting flexbar rule in Snakefile</w:t>
-      </w:r>
-      <w:r>
-        <w:t xml:space="preserve"> </w:t>
-      </w:r>
-      <w:r>
         <w:t xml:space="preserve">- Requires barcode FASTA files (auto-generated from metadata)</w:t>
+      </w:r>
+      <w:r>
+        <w:t xml:space="preserve"> </w:t>
+      </w:r>
+      <w:r>
+        <w:t xml:space="preserve">-</w:t>
+      </w:r>
+      <w:r>
+        <w:t xml:space="preserve"> </w:t>
+      </w:r>
+      <w:r>
+        <w:rPr>
+          <w:rStyle w:val="VerbatimChar"/>
+        </w:rPr>
+        <w:t xml:space="preserve">flexbar_barcode_leader_n</w:t>
+      </w:r>
+      <w:r>
+        <w:t xml:space="preserve"> </w:t>
+      </w:r>
+      <w:r>
+        <w:t xml:space="preserve">/</w:t>
+      </w:r>
+      <w:r>
+        <w:t xml:space="preserve"> </w:t>
+      </w:r>
+      <w:r>
+        <w:rPr>
+          <w:rStyle w:val="VerbatimChar"/>
+        </w:rPr>
+        <w:t xml:space="preserve">flexbar_retry_min_reads</w:t>
+      </w:r>
+      <w:r>
+        <w:t xml:space="preserve"> </w:t>
+      </w:r>
+      <w:r>
+        <w:t xml:space="preserve">tune inline-barcode matching</w:t>
+      </w:r>
+      <w:r>
+        <w:t xml:space="preserve"> </w:t>
+      </w:r>
+      <w:r>
+        <w:t xml:space="preserve">- A bioconda</w:t>
+      </w:r>
+      <w:r>
+        <w:t xml:space="preserve"> </w:t>
+      </w:r>
+      <w:r>
+        <w:rPr>
+          <w:rStyle w:val="VerbatimChar"/>
+        </w:rPr>
+        <w:t xml:space="preserve">flexbar</w:t>
+      </w:r>
+      <w:r>
+        <w:t xml:space="preserve"> </w:t>
+      </w:r>
+      <w:r>
+        <w:t xml:space="preserve">is provided by pixi; point</w:t>
+      </w:r>
+      <w:r>
+        <w:t xml:space="preserve"> </w:t>
+      </w:r>
+      <w:r>
+        <w:rPr>
+          <w:rStyle w:val="VerbatimChar"/>
+        </w:rPr>
+        <w:t xml:space="preserve">flexbar_bin</w:t>
+      </w:r>
+      <w:r>
+        <w:t xml:space="preserve"> </w:t>
+      </w:r>
+      <w:r>
+        <w:t xml:space="preserve">at it to drop the custom build</w:t>
       </w:r>
       <w:r>
         <w:t xml:space="preserve"> </w:t>
@@ -1820,18 +2502,6 @@
     <w:abstractNumId w:val="991"/>
   </w:num>
   <w:num w:numId="1012">
-    <w:abstractNumId w:val="991"/>
-  </w:num>
-  <w:num w:numId="1013">
-    <w:abstractNumId w:val="991"/>
-  </w:num>
-  <w:num w:numId="1014">
-    <w:abstractNumId w:val="991"/>
-  </w:num>
-  <w:num w:numId="1015">
-    <w:abstractNumId w:val="991"/>
-  </w:num>
-  <w:num w:numId="1016">
     <w:abstractNumId w:val="991"/>
   </w:num>
 </w:numbering>

</xml_diff>